<commit_message>
Docs: batch 10 monitoring, problems 17-18
</commit_message>
<xml_diff>
--- a/MANUAL-SETUP-GUIDE.docx
+++ b/MANUAL-SETUP-GUIDE.docx
@@ -8095,7 +8095,7 @@
         </w:rPr>
         <w:t xml:space="preserve"> aaye to Jenkins ne key rotate kar di hai. </w:t>
       </w:r>
-      <w:hyperlink w:history="1" r:id="rIdzdg7fbrmim4etvrjj-vvi">
+      <w:hyperlink w:history="1" r:id="rId4th2dq0ub7hzy1akhp_jr">
         <w:r>
           <w:rPr>
             <w:u w:val="single"/>
@@ -34439,38 +34439,158 @@
     </w:p>
     <w:p>
       <w:pPr>
-        <w:pStyle w:val="Heading3"/>
-        <w:keepNext/>
-      </w:pPr>
-      <w:r>
-        <w:rPr>
-          <w:rFonts w:ascii="Calibri" w:cs="Calibri" w:eastAsia="Calibri" w:hAnsi="Calibri"/>
-        </w:rPr>
-        <w:t xml:space="preserve">G2. Slack setup (Alertmanager + Jenkins)</w:t>
-      </w:r>
-    </w:p>
-    <w:p>
-      <w:pPr>
-        <w:spacing w:after="120"/>
-      </w:pPr>
-      <w:r>
-        <w:rPr>
-          <w:rFonts w:ascii="Calibri" w:cs="Calibri" w:eastAsia="Calibri" w:hAnsi="Calibri"/>
-        </w:rPr>
-        <w:t xml:space="preserve">Alerts Slack pe aayenge. Slack free hai.</w:t>
-      </w:r>
-    </w:p>
-    <w:p>
-      <w:pPr>
-        <w:spacing w:after="120"/>
-      </w:pPr>
+        <w:pBdr>
+          <w:left w:val="single" w:color="E8A33D" w:sz="18" w:space="8"/>
+        </w:pBdr>
+        <w:shd w:fill="FFF8E6" w:color="auto" w:val="clear"/>
+        <w:spacing w:before="60" w:after="60"/>
+        <w:ind w:left="240"/>
+      </w:pPr>
+      <w:r>
+        <w:rPr>
+          <w:rFonts w:ascii="Calibri" w:cs="Calibri" w:eastAsia="Calibri" w:hAnsi="Calibri"/>
+        </w:rPr>
+        <w:t xml:space="preserve">💡 </w:t>
+      </w:r>
       <w:r>
         <w:rPr>
           <w:b/>
           <w:bCs/>
           <w:rFonts w:ascii="Calibri" w:cs="Calibri" w:eastAsia="Calibri" w:hAnsi="Calibri"/>
         </w:rPr>
-        <w:t xml:space="preserve">Step 1: Slack mein webhook bana</w:t>
+        <w:t xml:space="preserve">Screen pe dikhaye bina copy:</w:t>
+      </w:r>
+      <w:r>
+        <w:rPr>
+          <w:rFonts w:ascii="Calibri" w:cs="Calibri" w:eastAsia="Calibri" w:hAnsi="Calibri"/>
+        </w:rPr>
+        <w:t xml:space="preserve"> </w:t>
+      </w:r>
+      <w:r>
+        <w:rPr>
+          <w:color w:val="B0306A"/>
+          <w:sz w:val="19"/>
+          <w:szCs w:val="19"/>
+          <w:rFonts w:ascii="Consolas" w:cs="Consolas" w:eastAsia="Consolas" w:hAnsi="Consolas"/>
+          <w:shd w:fill="EEF1F5" w:color="auto" w:val="clear"/>
+        </w:rPr>
+        <w:t xml:space="preserve">... | base64 -d | clip</w:t>
+      </w:r>
+      <w:r>
+        <w:rPr>
+          <w:rFonts w:ascii="Calibri" w:cs="Calibri" w:eastAsia="Calibri" w:hAnsi="Calibri"/>
+        </w:rPr>
+        <w:t xml:space="preserve"> (Windows clipboard; Git Bash mein chalta hai). Screenshot mein password leak hone ka chance khatam. "Invalid password" aaye to aksar browser ka purana auto-fill hota hai: box khaali karke paste kar.</w:t>
+      </w:r>
+    </w:p>
+    <w:p>
+      <w:pPr>
+        <w:pBdr>
+          <w:left w:val="single" w:color="E8A33D" w:sz="18" w:space="8"/>
+        </w:pBdr>
+        <w:shd w:fill="FFF8E6" w:color="auto" w:val="clear"/>
+        <w:spacing w:before="60" w:after="60"/>
+        <w:ind w:left="240"/>
+      </w:pPr>
+      <w:r>
+        <w:rPr>
+          <w:b/>
+          <w:bCs/>
+          <w:rFonts w:ascii="Calibri" w:cs="Calibri" w:eastAsia="Calibri" w:hAnsi="Calibri"/>
+        </w:rPr>
+        <w:t xml:space="preserve">Password leak ho gaya? Rotate:</w:t>
+      </w:r>
+    </w:p>
+    <w:p>
+      <w:pPr>
+        <w:keepLines/>
+        <w:pBdr>
+          <w:top w:val="single" w:color="C9D1DB" w:sz="4" w:space="4"/>
+          <w:left w:val="single" w:color="C9D1DB" w:sz="4" w:space="4"/>
+          <w:right w:val="single" w:color="C9D1DB" w:sz="4" w:space="4"/>
+        </w:pBdr>
+        <w:shd w:fill="F4F6F8" w:color="auto" w:val="clear"/>
+        <w:spacing w:before="80" w:after="0" w:line="240"/>
+      </w:pPr>
+      <w:r>
+        <w:rPr>
+          <w:color w:val="1E1E1E"/>
+          <w:sz w:val="16"/>
+          <w:szCs w:val="16"/>
+          <w:rFonts w:ascii="Consolas" w:cs="Consolas" w:eastAsia="Consolas" w:hAnsi="Consolas"/>
+        </w:rPr>
+        <w:t xml:space="preserve">kubectl -n monitoring create secret generic grafana-admin --from-literal=admin-user=admin &gt;   --from-literal=admin-password="$(openssl rand -base64 18)" --dry-run=client -o yaml | kubectl apply -f -</w:t>
+      </w:r>
+    </w:p>
+    <w:p>
+      <w:pPr>
+        <w:keepLines/>
+        <w:pBdr>
+          <w:left w:val="single" w:color="C9D1DB" w:sz="4" w:space="4"/>
+          <w:bottom w:val="single" w:color="C9D1DB" w:sz="4" w:space="4"/>
+          <w:right w:val="single" w:color="C9D1DB" w:sz="4" w:space="4"/>
+        </w:pBdr>
+        <w:shd w:fill="F4F6F8" w:color="auto" w:val="clear"/>
+        <w:spacing w:before="0" w:after="160" w:line="240"/>
+      </w:pPr>
+      <w:r>
+        <w:rPr>
+          <w:color w:val="1E1E1E"/>
+          <w:sz w:val="16"/>
+          <w:szCs w:val="16"/>
+          <w:rFonts w:ascii="Consolas" w:cs="Consolas" w:eastAsia="Consolas" w:hAnsi="Consolas"/>
+        </w:rPr>
+        <w:t xml:space="preserve">kubectl -n monitoring rollout restart deploy kube-prometheus-stack-grafana</w:t>
+      </w:r>
+    </w:p>
+    <w:p>
+      <w:pPr>
+        <w:pBdr>
+          <w:left w:val="single" w:color="E8A33D" w:sz="18" w:space="8"/>
+        </w:pBdr>
+        <w:shd w:fill="FFF8E6" w:color="auto" w:val="clear"/>
+        <w:spacing w:before="60" w:after="60"/>
+        <w:ind w:left="240"/>
+      </w:pPr>
+      <w:r>
+        <w:rPr>
+          <w:rFonts w:ascii="Calibri" w:cs="Calibri" w:eastAsia="Calibri" w:hAnsi="Calibri"/>
+        </w:rPr>
+        <w:t xml:space="preserve">Grafana ka DB </w:t>
+      </w:r>
+      <w:r>
+        <w:rPr>
+          <w:color w:val="B0306A"/>
+          <w:sz w:val="19"/>
+          <w:szCs w:val="19"/>
+          <w:rFonts w:ascii="Consolas" w:cs="Consolas" w:eastAsia="Consolas" w:hAnsi="Consolas"/>
+          <w:shd w:fill="EEF1F5" w:color="auto" w:val="clear"/>
+        </w:rPr>
+        <w:t xml:space="preserve">emptyDir</w:t>
+      </w:r>
+      <w:r>
+        <w:rPr>
+          <w:rFonts w:ascii="Calibri" w:cs="Calibri" w:eastAsia="Calibri" w:hAnsi="Calibri"/>
+        </w:rPr>
+        <w:t xml:space="preserve"> mein hai, to restart pe naya DB banta hai aur admin password Secret se dobara padha jaata hai.</w:t>
+      </w:r>
+    </w:p>
+    <w:p>
+      <w:pPr>
+        <w:spacing w:after="60"/>
+      </w:pPr>
+    </w:p>
+    <w:p>
+      <w:pPr>
+        <w:spacing w:after="120"/>
+      </w:pPr>
+      <w:r>
+        <w:rPr>
+          <w:b/>
+          <w:bCs/>
+          <w:rFonts w:ascii="Calibri" w:cs="Calibri" w:eastAsia="Calibri" w:hAnsi="Calibri"/>
+        </w:rPr>
+        <w:t xml:space="preserve">🧠 Kyun (interview ke liye):</w:t>
       </w:r>
     </w:p>
     <w:p>
@@ -34482,7 +34602,229 @@
         </w:numPr>
         <w:spacing w:before="20" w:after="40"/>
       </w:pPr>
-      <w:hyperlink w:history="1" r:id="rIdrsmt8c8ewotbrpp_gv18l">
+      <w:r>
+        <w:rPr>
+          <w:b/>
+          <w:bCs/>
+          <w:rFonts w:ascii="Calibri" w:cs="Calibri" w:eastAsia="Calibri" w:hAnsi="Calibri"/>
+        </w:rPr>
+        <w:t xml:space="preserve">Prometheus pull model:</w:t>
+      </w:r>
+      <w:r>
+        <w:rPr>
+          <w:rFonts w:ascii="Calibri" w:cs="Calibri" w:eastAsia="Calibri" w:hAnsi="Calibri"/>
+        </w:rPr>
+        <w:t xml:space="preserve"> har 15s apps ke </w:t>
+      </w:r>
+      <w:r>
+        <w:rPr>
+          <w:color w:val="B0306A"/>
+          <w:sz w:val="19"/>
+          <w:szCs w:val="19"/>
+          <w:rFonts w:ascii="Consolas" w:cs="Consolas" w:eastAsia="Consolas" w:hAnsi="Consolas"/>
+          <w:shd w:fill="EEF1F5" w:color="auto" w:val="clear"/>
+        </w:rPr>
+        <w:t xml:space="preserve">/metrics</w:t>
+      </w:r>
+      <w:r>
+        <w:rPr>
+          <w:rFonts w:ascii="Calibri" w:cs="Calibri" w:eastAsia="Calibri" w:hAnsi="Calibri"/>
+        </w:rPr>
+        <w:t xml:space="preserve"> se data kheenchta hai. Kahan se, ye </w:t>
+      </w:r>
+      <w:r>
+        <w:rPr>
+          <w:b/>
+          <w:bCs/>
+          <w:rFonts w:ascii="Calibri" w:cs="Calibri" w:eastAsia="Calibri" w:hAnsi="Calibri"/>
+        </w:rPr>
+        <w:t xml:space="preserve">ServiceMonitor</w:t>
+      </w:r>
+      <w:r>
+        <w:rPr>
+          <w:rFonts w:ascii="Calibri" w:cs="Calibri" w:eastAsia="Calibri" w:hAnsi="Calibri"/>
+        </w:rPr>
+        <w:t xml:space="preserve"> batata hai (app ke saath Git mein).</w:t>
+      </w:r>
+    </w:p>
+    <w:p>
+      <w:pPr>
+        <w:pStyle w:val="ListParagraph"/>
+        <w:numPr>
+          <w:ilvl w:val="0"/>
+          <w:numId w:val="36"/>
+        </w:numPr>
+        <w:spacing w:before="20" w:after="40"/>
+      </w:pPr>
+      <w:r>
+        <w:rPr>
+          <w:b/>
+          <w:bCs/>
+          <w:color w:val="B0306A"/>
+          <w:sz w:val="19"/>
+          <w:szCs w:val="19"/>
+          <w:rFonts w:ascii="Consolas" w:cs="Consolas" w:eastAsia="Consolas" w:hAnsi="Consolas"/>
+          <w:shd w:fill="EEF1F5" w:color="auto" w:val="clear"/>
+        </w:rPr>
+        <w:t xml:space="preserve">rate(counter[5m])</w:t>
+      </w:r>
+      <w:r>
+        <w:rPr>
+          <w:b/>
+          <w:bCs/>
+          <w:rFonts w:ascii="Calibri" w:cs="Calibri" w:eastAsia="Calibri" w:hAnsi="Calibri"/>
+        </w:rPr>
+        <w:t xml:space="preserve">:</w:t>
+      </w:r>
+      <w:r>
+        <w:rPr>
+          <w:rFonts w:ascii="Calibri" w:cs="Calibri" w:eastAsia="Calibri" w:hAnsi="Calibri"/>
+        </w:rPr>
+        <w:t xml:space="preserve"> counter hamesha badhta hai. </w:t>
+      </w:r>
+      <w:r>
+        <w:rPr>
+          <w:color w:val="B0306A"/>
+          <w:sz w:val="19"/>
+          <w:szCs w:val="19"/>
+          <w:rFonts w:ascii="Consolas" w:cs="Consolas" w:eastAsia="Consolas" w:hAnsi="Consolas"/>
+          <w:shd w:fill="EEF1F5" w:color="auto" w:val="clear"/>
+        </w:rPr>
+        <w:t xml:space="preserve">rate</w:t>
+      </w:r>
+      <w:r>
+        <w:rPr>
+          <w:rFonts w:ascii="Calibri" w:cs="Calibri" w:eastAsia="Calibri" w:hAnsi="Calibri"/>
+        </w:rPr>
+        <w:t xml:space="preserve"> = pichhle 5 min ki per-second badhat. Raw counter pe graph/alert nahi banate. Quick check: </w:t>
+      </w:r>
+      <w:r>
+        <w:rPr>
+          <w:color w:val="B0306A"/>
+          <w:sz w:val="19"/>
+          <w:szCs w:val="19"/>
+          <w:rFonts w:ascii="Consolas" w:cs="Consolas" w:eastAsia="Consolas" w:hAnsi="Consolas"/>
+          <w:shd w:fill="EEF1F5" w:color="auto" w:val="clear"/>
+        </w:rPr>
+        <w:t xml:space="preserve">sum(rate(orders_placed_total[5m]))</w:t>
+      </w:r>
+      <w:r>
+        <w:rPr>
+          <w:rFonts w:ascii="Calibri" w:cs="Calibri" w:eastAsia="Calibri" w:hAnsi="Calibri"/>
+        </w:rPr>
+        <w:t xml:space="preserve"> (traffic-generator ~1/s).</w:t>
+      </w:r>
+    </w:p>
+    <w:p>
+      <w:pPr>
+        <w:pStyle w:val="ListParagraph"/>
+        <w:numPr>
+          <w:ilvl w:val="0"/>
+          <w:numId w:val="36"/>
+        </w:numPr>
+        <w:spacing w:before="20" w:after="40"/>
+      </w:pPr>
+      <w:r>
+        <w:rPr>
+          <w:b/>
+          <w:bCs/>
+          <w:rFonts w:ascii="Calibri" w:cs="Calibri" w:eastAsia="Calibri" w:hAnsi="Calibri"/>
+        </w:rPr>
+        <w:t xml:space="preserve">Grafana sirf dikhata hai.</w:t>
+      </w:r>
+      <w:r>
+        <w:rPr>
+          <w:rFonts w:ascii="Calibri" w:cs="Calibri" w:eastAsia="Calibri" w:hAnsi="Calibri"/>
+        </w:rPr>
+        <w:t xml:space="preserve"> Data Prometheus ka, dashboards Git mein (</w:t>
+      </w:r>
+      <w:r>
+        <w:rPr>
+          <w:color w:val="B0306A"/>
+          <w:sz w:val="19"/>
+          <w:szCs w:val="19"/>
+          <w:rFonts w:ascii="Consolas" w:cs="Consolas" w:eastAsia="Consolas" w:hAnsi="Consolas"/>
+          <w:shd w:fill="EEF1F5" w:color="auto" w:val="clear"/>
+        </w:rPr>
+        <w:t xml:space="preserve">dashboards/*.json</w:t>
+      </w:r>
+      <w:r>
+        <w:rPr>
+          <w:rFonts w:ascii="Calibri" w:cs="Calibri" w:eastAsia="Calibri" w:hAnsi="Calibri"/>
+        </w:rPr>
+        <w:t xml:space="preserve">), sidecar apne aap load karta hai.</w:t>
+      </w:r>
+    </w:p>
+    <w:p>
+      <w:pPr>
+        <w:pStyle w:val="ListParagraph"/>
+        <w:numPr>
+          <w:ilvl w:val="0"/>
+          <w:numId w:val="36"/>
+        </w:numPr>
+        <w:spacing w:before="20" w:after="40"/>
+      </w:pPr>
+      <w:r>
+        <w:rPr>
+          <w:b/>
+          <w:bCs/>
+          <w:rFonts w:ascii="Calibri" w:cs="Calibri" w:eastAsia="Calibri" w:hAnsi="Calibri"/>
+        </w:rPr>
+        <w:t xml:space="preserve">Watchdog</w:t>
+      </w:r>
+      <w:r>
+        <w:rPr>
+          <w:rFonts w:ascii="Calibri" w:cs="Calibri" w:eastAsia="Calibri" w:hAnsi="Calibri"/>
+        </w:rPr>
+        <w:t xml:space="preserve"> hamesha firing = alerting pipeline zinda hai (dead man's switch).</w:t>
+      </w:r>
+    </w:p>
+    <w:p>
+      <w:pPr>
+        <w:pStyle w:val="Heading3"/>
+        <w:keepNext/>
+      </w:pPr>
+      <w:r>
+        <w:rPr>
+          <w:rFonts w:ascii="Calibri" w:cs="Calibri" w:eastAsia="Calibri" w:hAnsi="Calibri"/>
+        </w:rPr>
+        <w:t xml:space="preserve">G2. Slack setup (Alertmanager + Jenkins)</w:t>
+      </w:r>
+    </w:p>
+    <w:p>
+      <w:pPr>
+        <w:spacing w:after="120"/>
+      </w:pPr>
+      <w:r>
+        <w:rPr>
+          <w:rFonts w:ascii="Calibri" w:cs="Calibri" w:eastAsia="Calibri" w:hAnsi="Calibri"/>
+        </w:rPr>
+        <w:t xml:space="preserve">Alerts Slack pe aayenge. Slack free hai.</w:t>
+      </w:r>
+    </w:p>
+    <w:p>
+      <w:pPr>
+        <w:spacing w:after="120"/>
+      </w:pPr>
+      <w:r>
+        <w:rPr>
+          <w:b/>
+          <w:bCs/>
+          <w:rFonts w:ascii="Calibri" w:cs="Calibri" w:eastAsia="Calibri" w:hAnsi="Calibri"/>
+        </w:rPr>
+        <w:t xml:space="preserve">Step 1: Slack mein webhook bana</w:t>
+      </w:r>
+    </w:p>
+    <w:p>
+      <w:pPr>
+        <w:pStyle w:val="ListParagraph"/>
+        <w:numPr>
+          <w:ilvl w:val="0"/>
+          <w:numId w:val="37"/>
+        </w:numPr>
+        <w:spacing w:before="20" w:after="40"/>
+      </w:pPr>
+      <w:hyperlink w:history="1" r:id="rIdejnv7rwqkdioni6p88fhp">
         <w:r>
           <w:rPr>
             <w:u w:val="single"/>
@@ -34504,7 +34846,7 @@
         <w:pStyle w:val="ListParagraph"/>
         <w:numPr>
           <w:ilvl w:val="0"/>
-          <w:numId w:val="36"/>
+          <w:numId w:val="37"/>
         </w:numPr>
         <w:spacing w:before="20" w:after="40"/>
       </w:pPr>
@@ -34584,11 +34926,11 @@
         <w:pStyle w:val="ListParagraph"/>
         <w:numPr>
           <w:ilvl w:val="0"/>
-          <w:numId w:val="36"/>
+          <w:numId w:val="37"/>
         </w:numPr>
         <w:spacing w:before="20" w:after="40"/>
       </w:pPr>
-      <w:hyperlink w:history="1" r:id="rId5o0dreunkwufrmsgc5rxz">
+      <w:hyperlink w:history="1" r:id="rIdzpcume3_hkve66q7oyy5m">
         <w:r>
           <w:rPr>
             <w:u w:val="single"/>
@@ -34640,7 +34982,7 @@
         <w:pStyle w:val="ListParagraph"/>
         <w:numPr>
           <w:ilvl w:val="0"/>
-          <w:numId w:val="36"/>
+          <w:numId w:val="37"/>
         </w:numPr>
         <w:spacing w:before="20" w:after="40"/>
       </w:pPr>
@@ -34700,7 +35042,7 @@
         <w:pStyle w:val="ListParagraph"/>
         <w:numPr>
           <w:ilvl w:val="0"/>
-          <w:numId w:val="36"/>
+          <w:numId w:val="37"/>
         </w:numPr>
         <w:spacing w:before="20" w:after="40"/>
       </w:pPr>
@@ -34936,298 +35278,15 @@
         <w:rPr>
           <w:rFonts w:ascii="Calibri" w:cs="Calibri" w:eastAsia="Calibri" w:hAnsi="Calibri"/>
         </w:rPr>
-        <w:t xml:space="preserve">Secret ka naam aur key (</w:t>
-      </w:r>
-      <w:r>
-        <w:rPr>
-          <w:color w:val="B0306A"/>
-          <w:sz w:val="19"/>
-          <w:szCs w:val="19"/>
-          <w:rFonts w:ascii="Consolas" w:cs="Consolas" w:eastAsia="Consolas" w:hAnsi="Consolas"/>
-          <w:shd w:fill="EEF1F5" w:color="auto" w:val="clear"/>
-        </w:rPr>
-        <w:t xml:space="preserve">alertmanager-slack</w:t>
-      </w:r>
-      <w:r>
-        <w:rPr>
-          <w:rFonts w:ascii="Calibri" w:cs="Calibri" w:eastAsia="Calibri" w:hAnsi="Calibri"/>
-        </w:rPr>
-        <w:t xml:space="preserve"> / </w:t>
-      </w:r>
-      <w:r>
-        <w:rPr>
-          <w:color w:val="B0306A"/>
-          <w:sz w:val="19"/>
-          <w:szCs w:val="19"/>
-          <w:rFonts w:ascii="Consolas" w:cs="Consolas" w:eastAsia="Consolas" w:hAnsi="Consolas"/>
-          <w:shd w:fill="EEF1F5" w:color="auto" w:val="clear"/>
-        </w:rPr>
-        <w:t xml:space="preserve">webhook-url</w:t>
-      </w:r>
-      <w:r>
-        <w:rPr>
-          <w:rFonts w:ascii="Calibri" w:cs="Calibri" w:eastAsia="Calibri" w:hAnsi="Calibri"/>
-        </w:rPr>
-        <w:t xml:space="preserve">) exactly yahi rakhna. Alertmanager config file </w:t>
-      </w:r>
-      <w:r>
-        <w:rPr>
-          <w:color w:val="B0306A"/>
-          <w:sz w:val="19"/>
-          <w:szCs w:val="19"/>
-          <w:rFonts w:ascii="Consolas" w:cs="Consolas" w:eastAsia="Consolas" w:hAnsi="Consolas"/>
-          <w:shd w:fill="EEF1F5" w:color="auto" w:val="clear"/>
-        </w:rPr>
-        <w:t xml:space="preserve">/etc/alertmanager/secrets/alertmanager-slack/webhook-url</w:t>
-      </w:r>
-      <w:r>
-        <w:rPr>
-          <w:rFonts w:ascii="Calibri" w:cs="Calibri" w:eastAsia="Calibri" w:hAnsi="Calibri"/>
-        </w:rPr>
-        <w:t xml:space="preserve"> se URL padhta hai (</w:t>
-      </w:r>
-      <w:r>
-        <w:rPr>
-          <w:color w:val="B0306A"/>
-          <w:sz w:val="19"/>
-          <w:szCs w:val="19"/>
-          <w:rFonts w:ascii="Consolas" w:cs="Consolas" w:eastAsia="Consolas" w:hAnsi="Consolas"/>
-          <w:shd w:fill="EEF1F5" w:color="auto" w:val="clear"/>
-        </w:rPr>
-        <w:t xml:space="preserve">gitops/clusters/&lt;env&gt;/addons.yaml</w:t>
-      </w:r>
-      <w:r>
-        <w:rPr>
-          <w:rFonts w:ascii="Calibri" w:cs="Calibri" w:eastAsia="Calibri" w:hAnsi="Calibri"/>
-        </w:rPr>
-        <w:t xml:space="preserve"> mein </w:t>
-      </w:r>
-      <w:r>
-        <w:rPr>
-          <w:color w:val="B0306A"/>
-          <w:sz w:val="19"/>
-          <w:szCs w:val="19"/>
-          <w:rFonts w:ascii="Consolas" w:cs="Consolas" w:eastAsia="Consolas" w:hAnsi="Consolas"/>
-          <w:shd w:fill="EEF1F5" w:color="auto" w:val="clear"/>
-        </w:rPr>
-        <w:t xml:space="preserve">api_url_file</w:t>
-      </w:r>
-      <w:r>
-        <w:rPr>
-          <w:rFonts w:ascii="Calibri" w:cs="Calibri" w:eastAsia="Calibri" w:hAnsi="Calibri"/>
-        </w:rPr>
-        <w:t xml:space="preserve">).</w:t>
-      </w:r>
-    </w:p>
-    <w:p>
-      <w:pPr>
-        <w:spacing w:after="60"/>
-      </w:pPr>
-    </w:p>
-    <w:p>
-      <w:pPr>
-        <w:spacing w:after="120"/>
-      </w:pPr>
+        <w:t xml:space="preserve">💡 </w:t>
+      </w:r>
       <w:r>
         <w:rPr>
           <w:b/>
           <w:bCs/>
           <w:rFonts w:ascii="Calibri" w:cs="Calibri" w:eastAsia="Calibri" w:hAnsi="Calibri"/>
         </w:rPr>
-        <w:t xml:space="preserve">Step 3: Jenkins ko webhook de (pipeline notifications).</w:t>
-      </w:r>
-      <w:r>
-        <w:rPr>
-          <w:rFonts w:ascii="Calibri" w:cs="Calibri" w:eastAsia="Calibri" w:hAnsi="Calibri"/>
-        </w:rPr>
-        <w:t xml:space="preserve"> Manage Jenkins → Credentials → Add:</w:t>
-      </w:r>
-    </w:p>
-    <w:p>
-      <w:pPr>
-        <w:pStyle w:val="ListParagraph"/>
-        <w:numPr>
-          <w:ilvl w:val="0"/>
-          <w:numId w:val="37"/>
-        </w:numPr>
-        <w:spacing w:before="20" w:after="40"/>
-      </w:pPr>
-      <w:r>
-        <w:rPr>
-          <w:rFonts w:ascii="Calibri" w:cs="Calibri" w:eastAsia="Calibri" w:hAnsi="Calibri"/>
-        </w:rPr>
-        <w:t xml:space="preserve">Kind: </w:t>
-      </w:r>
-      <w:r>
-        <w:rPr>
-          <w:b/>
-          <w:bCs/>
-          <w:rFonts w:ascii="Calibri" w:cs="Calibri" w:eastAsia="Calibri" w:hAnsi="Calibri"/>
-        </w:rPr>
-        <w:t xml:space="preserve">Secret text</w:t>
-      </w:r>
-    </w:p>
-    <w:p>
-      <w:pPr>
-        <w:pStyle w:val="ListParagraph"/>
-        <w:numPr>
-          <w:ilvl w:val="0"/>
-          <w:numId w:val="37"/>
-        </w:numPr>
-        <w:spacing w:before="20" w:after="40"/>
-      </w:pPr>
-      <w:r>
-        <w:rPr>
-          <w:rFonts w:ascii="Calibri" w:cs="Calibri" w:eastAsia="Calibri" w:hAnsi="Calibri"/>
-        </w:rPr>
-        <w:t xml:space="preserve">Secret: </w:t>
-      </w:r>
-      <w:r>
-        <w:rPr>
-          <w:color w:val="B0306A"/>
-          <w:sz w:val="19"/>
-          <w:szCs w:val="19"/>
-          <w:rFonts w:ascii="Consolas" w:cs="Consolas" w:eastAsia="Consolas" w:hAnsi="Consolas"/>
-          <w:shd w:fill="EEF1F5" w:color="auto" w:val="clear"/>
-        </w:rPr>
-        <w:t xml:space="preserve">#deployments</w:t>
-      </w:r>
-      <w:r>
-        <w:rPr>
-          <w:rFonts w:ascii="Calibri" w:cs="Calibri" w:eastAsia="Calibri" w:hAnsi="Calibri"/>
-        </w:rPr>
-        <w:t xml:space="preserve"> channel ka webhook URL</w:t>
-      </w:r>
-    </w:p>
-    <w:p>
-      <w:pPr>
-        <w:pStyle w:val="ListParagraph"/>
-        <w:numPr>
-          <w:ilvl w:val="0"/>
-          <w:numId w:val="37"/>
-        </w:numPr>
-        <w:spacing w:before="20" w:after="40"/>
-      </w:pPr>
-      <w:r>
-        <w:rPr>
-          <w:rFonts w:ascii="Calibri" w:cs="Calibri" w:eastAsia="Calibri" w:hAnsi="Calibri"/>
-        </w:rPr>
-        <w:t xml:space="preserve">ID: </w:t>
-      </w:r>
-      <w:r>
-        <w:rPr>
-          <w:color w:val="B0306A"/>
-          <w:sz w:val="19"/>
-          <w:szCs w:val="19"/>
-          <w:rFonts w:ascii="Consolas" w:cs="Consolas" w:eastAsia="Consolas" w:hAnsi="Consolas"/>
-          <w:shd w:fill="EEF1F5" w:color="auto" w:val="clear"/>
-        </w:rPr>
-        <w:t xml:space="preserve">slack-webhook</w:t>
-      </w:r>
-      <w:r>
-        <w:rPr>
-          <w:rFonts w:ascii="Calibri" w:cs="Calibri" w:eastAsia="Calibri" w:hAnsi="Calibri"/>
-        </w:rPr>
-        <w:t xml:space="preserve"> (exactly yahi)</w:t>
-      </w:r>
-    </w:p>
-    <w:p>
-      <w:pPr>
-        <w:spacing w:after="120"/>
-      </w:pPr>
-      <w:r>
-        <w:rPr>
-          <w:rFonts w:ascii="Calibri" w:cs="Calibri" w:eastAsia="Calibri" w:hAnsi="Calibri"/>
-        </w:rPr>
-        <w:t xml:space="preserve">Ye optional hai. Credential nahi hoga to pipeline chalti rahegi, bas log mein "Slack notification skipped" aayega.</w:t>
-      </w:r>
-    </w:p>
-    <w:p>
-      <w:pPr>
-        <w:pStyle w:val="Heading3"/>
-        <w:keepNext/>
-      </w:pPr>
-      <w:r>
-        <w:rPr>
-          <w:rFonts w:ascii="Calibri" w:cs="Calibri" w:eastAsia="Calibri" w:hAnsi="Calibri"/>
-        </w:rPr>
-        <w:t xml:space="preserve">G3. CloudWatch email alerts (SNS)</w:t>
-      </w:r>
-    </w:p>
-    <w:p>
-      <w:pPr>
-        <w:spacing w:after="120"/>
-      </w:pPr>
-      <w:r>
-        <w:rPr>
-          <w:color w:val="B0306A"/>
-          <w:sz w:val="19"/>
-          <w:szCs w:val="19"/>
-          <w:rFonts w:ascii="Consolas" w:cs="Consolas" w:eastAsia="Consolas" w:hAnsi="Consolas"/>
-          <w:shd w:fill="EEF1F5" w:color="auto" w:val="clear"/>
-        </w:rPr>
-        <w:t xml:space="preserve">terraform apply</w:t>
-      </w:r>
-      <w:r>
-        <w:rPr>
-          <w:rFonts w:ascii="Calibri" w:cs="Calibri" w:eastAsia="Calibri" w:hAnsi="Calibri"/>
-        </w:rPr>
-        <w:t xml:space="preserve"> (shared stack) ke baad AWS tere </w:t>
-      </w:r>
-      <w:r>
-        <w:rPr>
-          <w:color w:val="B0306A"/>
-          <w:sz w:val="19"/>
-          <w:szCs w:val="19"/>
-          <w:rFonts w:ascii="Consolas" w:cs="Consolas" w:eastAsia="Consolas" w:hAnsi="Consolas"/>
-          <w:shd w:fill="EEF1F5" w:color="auto" w:val="clear"/>
-        </w:rPr>
-        <w:t xml:space="preserve">alert_email</w:t>
-      </w:r>
-      <w:r>
-        <w:rPr>
-          <w:rFonts w:ascii="Calibri" w:cs="Calibri" w:eastAsia="Calibri" w:hAnsi="Calibri"/>
-        </w:rPr>
-        <w:t xml:space="preserve"> pe </w:t>
-      </w:r>
-      <w:r>
-        <w:rPr>
-          <w:b/>
-          <w:bCs/>
-          <w:rFonts w:ascii="Calibri" w:cs="Calibri" w:eastAsia="Calibri" w:hAnsi="Calibri"/>
-        </w:rPr>
-        <w:t xml:space="preserve">"AWS Notification - Subscription Confirmation"</w:t>
-      </w:r>
-      <w:r>
-        <w:rPr>
-          <w:rFonts w:ascii="Calibri" w:cs="Calibri" w:eastAsia="Calibri" w:hAnsi="Calibri"/>
-        </w:rPr>
-        <w:t xml:space="preserve"> mail bhejta hai. </w:t>
-      </w:r>
-      <w:r>
-        <w:rPr>
-          <w:b/>
-          <w:bCs/>
-          <w:rFonts w:ascii="Calibri" w:cs="Calibri" w:eastAsia="Calibri" w:hAnsi="Calibri"/>
-        </w:rPr>
-        <w:t xml:space="preserve">"Confirm subscription" link pe click kar</w:t>
-      </w:r>
-      <w:r>
-        <w:rPr>
-          <w:rFonts w:ascii="Calibri" w:cs="Calibri" w:eastAsia="Calibri" w:hAnsi="Calibri"/>
-        </w:rPr>
-        <w:t xml:space="preserve">, warna ek bhi email nahi aayega. Spam folder bhi check kar.</w:t>
-      </w:r>
-    </w:p>
-    <w:p>
-      <w:pPr>
-        <w:spacing w:after="120"/>
-      </w:pPr>
-      <w:r>
-        <w:rPr>
-          <w:rFonts w:ascii="Calibri" w:cs="Calibri" w:eastAsia="Calibri" w:hAnsi="Calibri"/>
-        </w:rPr>
-        <w:t xml:space="preserve">Check:</w:t>
+        <w:t xml:space="preserve">URL screen pe dikhaye bina (behtar tareeka):</w:t>
       </w:r>
     </w:p>
     <w:p>
@@ -35248,7 +35307,47 @@
           <w:szCs w:val="16"/>
           <w:rFonts w:ascii="Consolas" w:cs="Consolas" w:eastAsia="Consolas" w:hAnsi="Consolas"/>
         </w:rPr>
-        <w:t xml:space="preserve">aws sns list-subscriptions --query "Subscriptions[?contains(TopicArn,'order-platform-alerts')].[Endpoint,SubscriptionArn]" --output table</w:t>
+        <w:t xml:space="preserve">read -rs SLACK_URL          # paste + Enter; kuch nahi dikhega (-s silent, -r backslash as-is)</w:t>
+      </w:r>
+    </w:p>
+    <w:p>
+      <w:pPr>
+        <w:keepLines/>
+        <w:pBdr>
+          <w:left w:val="single" w:color="C9D1DB" w:sz="4" w:space="4"/>
+          <w:right w:val="single" w:color="C9D1DB" w:sz="4" w:space="4"/>
+        </w:pBdr>
+        <w:shd w:fill="F4F6F8" w:color="auto" w:val="clear"/>
+        <w:spacing w:before="0" w:after="0" w:line="240"/>
+      </w:pPr>
+      <w:r>
+        <w:rPr>
+          <w:color w:val="1E1E1E"/>
+          <w:sz w:val="16"/>
+          <w:szCs w:val="16"/>
+          <w:rFonts w:ascii="Consolas" w:cs="Consolas" w:eastAsia="Consolas" w:hAnsi="Consolas"/>
+        </w:rPr>
+        <w:t xml:space="preserve">echo "length: ${#SLACK_URL}"</w:t>
+      </w:r>
+    </w:p>
+    <w:p>
+      <w:pPr>
+        <w:keepLines/>
+        <w:pBdr>
+          <w:left w:val="single" w:color="C9D1DB" w:sz="4" w:space="4"/>
+          <w:right w:val="single" w:color="C9D1DB" w:sz="4" w:space="4"/>
+        </w:pBdr>
+        <w:shd w:fill="F4F6F8" w:color="auto" w:val="clear"/>
+        <w:spacing w:before="0" w:after="0" w:line="240"/>
+      </w:pPr>
+      <w:r>
+        <w:rPr>
+          <w:color w:val="1E1E1E"/>
+          <w:sz w:val="16"/>
+          <w:szCs w:val="16"/>
+          <w:rFonts w:ascii="Consolas" w:cs="Consolas" w:eastAsia="Consolas" w:hAnsi="Consolas"/>
+        </w:rPr>
+        <w:t xml:space="preserve">kubectl -n monitoring create secret generic alertmanager-slack --from-literal=webhook-url="$SLACK_URL" &gt;   --dry-run=client -o yaml | kubectl apply -f -</w:t>
       </w:r>
     </w:p>
     <w:p>
@@ -35269,7 +35368,602 @@
           <w:szCs w:val="16"/>
           <w:rFonts w:ascii="Consolas" w:cs="Consolas" w:eastAsia="Consolas" w:hAnsi="Consolas"/>
         </w:rPr>
-        <w:t xml:space="preserve"># SubscriptionArn "PendingConfirmation" hai to abhi confirm nahi hua</w:t>
+        <w:t xml:space="preserve">unset SLACK_URL</w:t>
+      </w:r>
+    </w:p>
+    <w:p>
+      <w:pPr>
+        <w:pBdr>
+          <w:left w:val="single" w:color="E8A33D" w:sz="18" w:space="8"/>
+        </w:pBdr>
+        <w:shd w:fill="FFF8E6" w:color="auto" w:val="clear"/>
+        <w:spacing w:before="60" w:after="60"/>
+        <w:ind w:left="240"/>
+      </w:pPr>
+      <w:r>
+        <w:rPr>
+          <w:color w:val="B0306A"/>
+          <w:sz w:val="19"/>
+          <w:szCs w:val="19"/>
+          <w:rFonts w:ascii="Consolas" w:cs="Consolas" w:eastAsia="Consolas" w:hAnsi="Consolas"/>
+          <w:shd w:fill="EEF1F5" w:color="auto" w:val="clear"/>
+        </w:rPr>
+        <w:t xml:space="preserve">--from-literal='https://...'</w:t>
+      </w:r>
+      <w:r>
+        <w:rPr>
+          <w:rFonts w:ascii="Calibri" w:cs="Calibri" w:eastAsia="Calibri" w:hAnsi="Calibri"/>
+        </w:rPr>
+        <w:t xml:space="preserve"> seedha likhne se URL terminal aur bash history mein reh jaata hai.</w:t>
+      </w:r>
+    </w:p>
+    <w:p>
+      <w:pPr>
+        <w:pBdr>
+          <w:left w:val="single" w:color="E8A33D" w:sz="18" w:space="8"/>
+        </w:pBdr>
+        <w:shd w:fill="FFF8E6" w:color="auto" w:val="clear"/>
+        <w:spacing w:before="60" w:after="60"/>
+        <w:ind w:left="240"/>
+      </w:pPr>
+      <w:r>
+        <w:rPr>
+          <w:color w:val="B0306A"/>
+          <w:sz w:val="19"/>
+          <w:szCs w:val="19"/>
+          <w:rFonts w:ascii="Consolas" w:cs="Consolas" w:eastAsia="Consolas" w:hAnsi="Consolas"/>
+          <w:shd w:fill="EEF1F5" w:color="auto" w:val="clear"/>
+        </w:rPr>
+        <w:t xml:space="preserve">Warning: ... missing the kubectl.kubernetes.io/last-applied-configuration annotation</w:t>
+      </w:r>
+      <w:r>
+        <w:rPr>
+          <w:rFonts w:ascii="Calibri" w:cs="Calibri" w:eastAsia="Calibri" w:hAnsi="Calibri"/>
+        </w:rPr>
+        <w:t xml:space="preserve">: harmless. Secret </w:t>
+      </w:r>
+      <w:r>
+        <w:rPr>
+          <w:color w:val="B0306A"/>
+          <w:sz w:val="19"/>
+          <w:szCs w:val="19"/>
+          <w:rFonts w:ascii="Consolas" w:cs="Consolas" w:eastAsia="Consolas" w:hAnsi="Consolas"/>
+          <w:shd w:fill="EEF1F5" w:color="auto" w:val="clear"/>
+        </w:rPr>
+        <w:t xml:space="preserve">kubectl create</w:t>
+      </w:r>
+      <w:r>
+        <w:rPr>
+          <w:rFonts w:ascii="Calibri" w:cs="Calibri" w:eastAsia="Calibri" w:hAnsi="Calibri"/>
+        </w:rPr>
+        <w:t xml:space="preserve"> se bana tha; apply khud annotation jod deta hai.</w:t>
+      </w:r>
+    </w:p>
+    <w:p>
+      <w:pPr>
+        <w:pBdr>
+          <w:left w:val="single" w:color="E8A33D" w:sz="18" w:space="8"/>
+        </w:pBdr>
+        <w:shd w:fill="FFF8E6" w:color="auto" w:val="clear"/>
+        <w:spacing w:before="60" w:after="60"/>
+        <w:ind w:left="240"/>
+      </w:pPr>
+      <w:r>
+        <w:rPr>
+          <w:b/>
+          <w:bCs/>
+          <w:rFonts w:ascii="Calibri" w:cs="Calibri" w:eastAsia="Calibri" w:hAnsi="Calibri"/>
+        </w:rPr>
+        <w:t xml:space="preserve">Check delivery:</w:t>
+      </w:r>
+      <w:r>
+        <w:rPr>
+          <w:rFonts w:ascii="Calibri" w:cs="Calibri" w:eastAsia="Calibri" w:hAnsi="Calibri"/>
+        </w:rPr>
+        <w:t xml:space="preserve"> Prometheus mein </w:t>
+      </w:r>
+      <w:r>
+        <w:rPr>
+          <w:color w:val="B0306A"/>
+          <w:sz w:val="19"/>
+          <w:szCs w:val="19"/>
+          <w:rFonts w:ascii="Consolas" w:cs="Consolas" w:eastAsia="Consolas" w:hAnsi="Consolas"/>
+          <w:shd w:fill="EEF1F5" w:color="auto" w:val="clear"/>
+        </w:rPr>
+        <w:t xml:space="preserve">sum(alertmanager_notifications_total{integration="slack"})</w:t>
+      </w:r>
+      <w:r>
+        <w:rPr>
+          <w:rFonts w:ascii="Calibri" w:cs="Calibri" w:eastAsia="Calibri" w:hAnsi="Calibri"/>
+        </w:rPr>
+        <w:t xml:space="preserve"> badhna chahiye aur </w:t>
+      </w:r>
+      <w:r>
+        <w:rPr>
+          <w:color w:val="B0306A"/>
+          <w:sz w:val="19"/>
+          <w:szCs w:val="19"/>
+          <w:rFonts w:ascii="Consolas" w:cs="Consolas" w:eastAsia="Consolas" w:hAnsi="Consolas"/>
+          <w:shd w:fill="EEF1F5" w:color="auto" w:val="clear"/>
+        </w:rPr>
+        <w:t xml:space="preserve">sum(alertmanager_notifications_failed_total{integration="slack"})</w:t>
+      </w:r>
+      <w:r>
+        <w:rPr>
+          <w:rFonts w:ascii="Calibri" w:cs="Calibri" w:eastAsia="Calibri" w:hAnsi="Calibri"/>
+        </w:rPr>
+        <w:t xml:space="preserve"> = 0. Pehle messages aksar </w:t>
+      </w:r>
+      <w:r>
+        <w:rPr>
+          <w:color w:val="B0306A"/>
+          <w:sz w:val="19"/>
+          <w:szCs w:val="19"/>
+          <w:rFonts w:ascii="Consolas" w:cs="Consolas" w:eastAsia="Consolas" w:hAnsi="Consolas"/>
+          <w:shd w:fill="EEF1F5" w:color="auto" w:val="clear"/>
+        </w:rPr>
+        <w:t xml:space="preserve">AlertmanagerFailedToSendAlerts</w:t>
+      </w:r>
+      <w:r>
+        <w:rPr>
+          <w:rFonts w:ascii="Calibri" w:cs="Calibri" w:eastAsia="Calibri" w:hAnsi="Calibri"/>
+        </w:rPr>
+        <w:t xml:space="preserve"> hote hain (placeholder URL wale time ke); thodi der mein RESOLVED.</w:t>
+      </w:r>
+    </w:p>
+    <w:p>
+      <w:pPr>
+        <w:pBdr>
+          <w:left w:val="single" w:color="E8A33D" w:sz="18" w:space="8"/>
+        </w:pBdr>
+        <w:shd w:fill="FFF8E6" w:color="auto" w:val="clear"/>
+        <w:spacing w:before="60" w:after="60"/>
+        <w:ind w:left="240"/>
+      </w:pPr>
+      <w:r>
+        <w:rPr>
+          <w:rFonts w:ascii="Calibri" w:cs="Calibri" w:eastAsia="Calibri" w:hAnsi="Calibri"/>
+        </w:rPr>
+        <w:t xml:space="preserve">Slack ka "app is ready" popup (Slack CLI, </w:t>
+      </w:r>
+      <w:r>
+        <w:rPr>
+          <w:color w:val="B0306A"/>
+          <w:sz w:val="19"/>
+          <w:szCs w:val="19"/>
+          <w:rFonts w:ascii="Consolas" w:cs="Consolas" w:eastAsia="Consolas" w:hAnsi="Consolas"/>
+          <w:shd w:fill="EEF1F5" w:color="auto" w:val="clear"/>
+        </w:rPr>
+        <w:t xml:space="preserve">slack login</w:t>
+      </w:r>
+      <w:r>
+        <w:rPr>
+          <w:rFonts w:ascii="Calibri" w:cs="Calibri" w:eastAsia="Calibri" w:hAnsi="Calibri"/>
+        </w:rPr>
+        <w:t xml:space="preserve">, </w:t>
+      </w:r>
+      <w:r>
+        <w:rPr>
+          <w:color w:val="B0306A"/>
+          <w:sz w:val="19"/>
+          <w:szCs w:val="19"/>
+          <w:rFonts w:ascii="Consolas" w:cs="Consolas" w:eastAsia="Consolas" w:hAnsi="Consolas"/>
+          <w:shd w:fill="EEF1F5" w:color="auto" w:val="clear"/>
+        </w:rPr>
+        <w:t xml:space="preserve">slack create</w:t>
+      </w:r>
+      <w:r>
+        <w:rPr>
+          <w:rFonts w:ascii="Calibri" w:cs="Calibri" w:eastAsia="Calibri" w:hAnsi="Calibri"/>
+        </w:rPr>
+        <w:t xml:space="preserve">) </w:t>
+      </w:r>
+      <w:r>
+        <w:rPr>
+          <w:b/>
+          <w:bCs/>
+          <w:rFonts w:ascii="Calibri" w:cs="Calibri" w:eastAsia="Calibri" w:hAnsi="Calibri"/>
+        </w:rPr>
+        <w:t xml:space="preserve">ignore</w:t>
+      </w:r>
+      <w:r>
+        <w:rPr>
+          <w:rFonts w:ascii="Calibri" w:cs="Calibri" w:eastAsia="Calibri" w:hAnsi="Calibri"/>
+        </w:rPr>
+        <w:t xml:space="preserve"> kar: humein sirf Incoming Webhook chahiye (Go to App Settings → Incoming Webhooks).</w:t>
+      </w:r>
+    </w:p>
+    <w:p>
+      <w:pPr>
+        <w:spacing w:after="60"/>
+      </w:pPr>
+    </w:p>
+    <w:p>
+      <w:pPr>
+        <w:pBdr>
+          <w:left w:val="single" w:color="E8A33D" w:sz="18" w:space="8"/>
+        </w:pBdr>
+        <w:shd w:fill="FFF8E6" w:color="auto" w:val="clear"/>
+        <w:spacing w:before="60" w:after="60"/>
+        <w:ind w:left="240"/>
+      </w:pPr>
+      <w:r>
+        <w:rPr>
+          <w:rFonts w:ascii="Calibri" w:cs="Calibri" w:eastAsia="Calibri" w:hAnsi="Calibri"/>
+        </w:rPr>
+        <w:t xml:space="preserve">Secret ka naam aur key (</w:t>
+      </w:r>
+      <w:r>
+        <w:rPr>
+          <w:color w:val="B0306A"/>
+          <w:sz w:val="19"/>
+          <w:szCs w:val="19"/>
+          <w:rFonts w:ascii="Consolas" w:cs="Consolas" w:eastAsia="Consolas" w:hAnsi="Consolas"/>
+          <w:shd w:fill="EEF1F5" w:color="auto" w:val="clear"/>
+        </w:rPr>
+        <w:t xml:space="preserve">alertmanager-slack</w:t>
+      </w:r>
+      <w:r>
+        <w:rPr>
+          <w:rFonts w:ascii="Calibri" w:cs="Calibri" w:eastAsia="Calibri" w:hAnsi="Calibri"/>
+        </w:rPr>
+        <w:t xml:space="preserve"> / </w:t>
+      </w:r>
+      <w:r>
+        <w:rPr>
+          <w:color w:val="B0306A"/>
+          <w:sz w:val="19"/>
+          <w:szCs w:val="19"/>
+          <w:rFonts w:ascii="Consolas" w:cs="Consolas" w:eastAsia="Consolas" w:hAnsi="Consolas"/>
+          <w:shd w:fill="EEF1F5" w:color="auto" w:val="clear"/>
+        </w:rPr>
+        <w:t xml:space="preserve">webhook-url</w:t>
+      </w:r>
+      <w:r>
+        <w:rPr>
+          <w:rFonts w:ascii="Calibri" w:cs="Calibri" w:eastAsia="Calibri" w:hAnsi="Calibri"/>
+        </w:rPr>
+        <w:t xml:space="preserve">) exactly yahi rakhna. Alertmanager config file </w:t>
+      </w:r>
+      <w:r>
+        <w:rPr>
+          <w:color w:val="B0306A"/>
+          <w:sz w:val="19"/>
+          <w:szCs w:val="19"/>
+          <w:rFonts w:ascii="Consolas" w:cs="Consolas" w:eastAsia="Consolas" w:hAnsi="Consolas"/>
+          <w:shd w:fill="EEF1F5" w:color="auto" w:val="clear"/>
+        </w:rPr>
+        <w:t xml:space="preserve">/etc/alertmanager/secrets/alertmanager-slack/webhook-url</w:t>
+      </w:r>
+      <w:r>
+        <w:rPr>
+          <w:rFonts w:ascii="Calibri" w:cs="Calibri" w:eastAsia="Calibri" w:hAnsi="Calibri"/>
+        </w:rPr>
+        <w:t xml:space="preserve"> se URL padhta hai (</w:t>
+      </w:r>
+      <w:r>
+        <w:rPr>
+          <w:color w:val="B0306A"/>
+          <w:sz w:val="19"/>
+          <w:szCs w:val="19"/>
+          <w:rFonts w:ascii="Consolas" w:cs="Consolas" w:eastAsia="Consolas" w:hAnsi="Consolas"/>
+          <w:shd w:fill="EEF1F5" w:color="auto" w:val="clear"/>
+        </w:rPr>
+        <w:t xml:space="preserve">gitops/clusters/&lt;env&gt;/addons.yaml</w:t>
+      </w:r>
+      <w:r>
+        <w:rPr>
+          <w:rFonts w:ascii="Calibri" w:cs="Calibri" w:eastAsia="Calibri" w:hAnsi="Calibri"/>
+        </w:rPr>
+        <w:t xml:space="preserve"> mein </w:t>
+      </w:r>
+      <w:r>
+        <w:rPr>
+          <w:color w:val="B0306A"/>
+          <w:sz w:val="19"/>
+          <w:szCs w:val="19"/>
+          <w:rFonts w:ascii="Consolas" w:cs="Consolas" w:eastAsia="Consolas" w:hAnsi="Consolas"/>
+          <w:shd w:fill="EEF1F5" w:color="auto" w:val="clear"/>
+        </w:rPr>
+        <w:t xml:space="preserve">api_url_file</w:t>
+      </w:r>
+      <w:r>
+        <w:rPr>
+          <w:rFonts w:ascii="Calibri" w:cs="Calibri" w:eastAsia="Calibri" w:hAnsi="Calibri"/>
+        </w:rPr>
+        <w:t xml:space="preserve">).</w:t>
+      </w:r>
+    </w:p>
+    <w:p>
+      <w:pPr>
+        <w:spacing w:after="60"/>
+      </w:pPr>
+    </w:p>
+    <w:p>
+      <w:pPr>
+        <w:spacing w:after="120"/>
+      </w:pPr>
+      <w:r>
+        <w:rPr>
+          <w:b/>
+          <w:bCs/>
+          <w:rFonts w:ascii="Calibri" w:cs="Calibri" w:eastAsia="Calibri" w:hAnsi="Calibri"/>
+        </w:rPr>
+        <w:t xml:space="preserve">Step 3: Jenkins ko webhook de (pipeline notifications).</w:t>
+      </w:r>
+      <w:r>
+        <w:rPr>
+          <w:rFonts w:ascii="Calibri" w:cs="Calibri" w:eastAsia="Calibri" w:hAnsi="Calibri"/>
+        </w:rPr>
+        <w:t xml:space="preserve"> Manage Jenkins → Credentials → Add:</w:t>
+      </w:r>
+    </w:p>
+    <w:p>
+      <w:pPr>
+        <w:pStyle w:val="ListParagraph"/>
+        <w:numPr>
+          <w:ilvl w:val="0"/>
+          <w:numId w:val="38"/>
+        </w:numPr>
+        <w:spacing w:before="20" w:after="40"/>
+      </w:pPr>
+      <w:r>
+        <w:rPr>
+          <w:rFonts w:ascii="Calibri" w:cs="Calibri" w:eastAsia="Calibri" w:hAnsi="Calibri"/>
+        </w:rPr>
+        <w:t xml:space="preserve">Kind: </w:t>
+      </w:r>
+      <w:r>
+        <w:rPr>
+          <w:b/>
+          <w:bCs/>
+          <w:rFonts w:ascii="Calibri" w:cs="Calibri" w:eastAsia="Calibri" w:hAnsi="Calibri"/>
+        </w:rPr>
+        <w:t xml:space="preserve">Secret text</w:t>
+      </w:r>
+    </w:p>
+    <w:p>
+      <w:pPr>
+        <w:pStyle w:val="ListParagraph"/>
+        <w:numPr>
+          <w:ilvl w:val="0"/>
+          <w:numId w:val="38"/>
+        </w:numPr>
+        <w:spacing w:before="20" w:after="40"/>
+      </w:pPr>
+      <w:r>
+        <w:rPr>
+          <w:rFonts w:ascii="Calibri" w:cs="Calibri" w:eastAsia="Calibri" w:hAnsi="Calibri"/>
+        </w:rPr>
+        <w:t xml:space="preserve">Secret: </w:t>
+      </w:r>
+      <w:r>
+        <w:rPr>
+          <w:color w:val="B0306A"/>
+          <w:sz w:val="19"/>
+          <w:szCs w:val="19"/>
+          <w:rFonts w:ascii="Consolas" w:cs="Consolas" w:eastAsia="Consolas" w:hAnsi="Consolas"/>
+          <w:shd w:fill="EEF1F5" w:color="auto" w:val="clear"/>
+        </w:rPr>
+        <w:t xml:space="preserve">#deployments</w:t>
+      </w:r>
+      <w:r>
+        <w:rPr>
+          <w:rFonts w:ascii="Calibri" w:cs="Calibri" w:eastAsia="Calibri" w:hAnsi="Calibri"/>
+        </w:rPr>
+        <w:t xml:space="preserve"> channel ka webhook URL</w:t>
+      </w:r>
+    </w:p>
+    <w:p>
+      <w:pPr>
+        <w:pStyle w:val="ListParagraph"/>
+        <w:numPr>
+          <w:ilvl w:val="0"/>
+          <w:numId w:val="38"/>
+        </w:numPr>
+        <w:spacing w:before="20" w:after="40"/>
+      </w:pPr>
+      <w:r>
+        <w:rPr>
+          <w:rFonts w:ascii="Calibri" w:cs="Calibri" w:eastAsia="Calibri" w:hAnsi="Calibri"/>
+        </w:rPr>
+        <w:t xml:space="preserve">ID: </w:t>
+      </w:r>
+      <w:r>
+        <w:rPr>
+          <w:color w:val="B0306A"/>
+          <w:sz w:val="19"/>
+          <w:szCs w:val="19"/>
+          <w:rFonts w:ascii="Consolas" w:cs="Consolas" w:eastAsia="Consolas" w:hAnsi="Consolas"/>
+          <w:shd w:fill="EEF1F5" w:color="auto" w:val="clear"/>
+        </w:rPr>
+        <w:t xml:space="preserve">slack-webhook</w:t>
+      </w:r>
+      <w:r>
+        <w:rPr>
+          <w:rFonts w:ascii="Calibri" w:cs="Calibri" w:eastAsia="Calibri" w:hAnsi="Calibri"/>
+        </w:rPr>
+        <w:t xml:space="preserve"> (exactly yahi)</w:t>
+      </w:r>
+    </w:p>
+    <w:p>
+      <w:pPr>
+        <w:pBdr>
+          <w:left w:val="single" w:color="E8A33D" w:sz="18" w:space="8"/>
+        </w:pBdr>
+        <w:shd w:fill="FFF8E6" w:color="auto" w:val="clear"/>
+        <w:spacing w:before="60" w:after="60"/>
+        <w:ind w:left="240"/>
+      </w:pPr>
+      <w:r>
+        <w:rPr>
+          <w:rFonts w:ascii="Calibri" w:cs="Calibri" w:eastAsia="Calibri" w:hAnsi="Calibri"/>
+        </w:rPr>
+        <w:t xml:space="preserve">⚠️ Form ka title </w:t>
+      </w:r>
+      <w:r>
+        <w:rPr>
+          <w:b/>
+          <w:bCs/>
+          <w:rFonts w:ascii="Calibri" w:cs="Calibri" w:eastAsia="Calibri" w:hAnsi="Calibri"/>
+        </w:rPr>
+        <w:t xml:space="preserve">"Add Secret text"</w:t>
+      </w:r>
+      <w:r>
+        <w:rPr>
+          <w:rFonts w:ascii="Calibri" w:cs="Calibri" w:eastAsia="Calibri" w:hAnsi="Calibri"/>
+        </w:rPr>
+        <w:t xml:space="preserve"> hona chahiye. "Username with password" mein bhara to Jenkins hint deta hai </w:t>
+      </w:r>
+      <w:r>
+        <w:rPr>
+          <w:i/>
+          <w:iCs/>
+          <w:rFonts w:ascii="Calibri" w:cs="Calibri" w:eastAsia="Calibri" w:hAnsi="Calibri"/>
+        </w:rPr>
+        <w:t xml:space="preserve">"did you mean secret text?"</w:t>
+      </w:r>
+      <w:r>
+        <w:rPr>
+          <w:rFonts w:ascii="Calibri" w:cs="Calibri" w:eastAsia="Calibri" w:hAnsi="Calibri"/>
+        </w:rPr>
+        <w:t xml:space="preserve">, aur Jenkinsfile ka </w:t>
+      </w:r>
+      <w:r>
+        <w:rPr>
+          <w:color w:val="B0306A"/>
+          <w:sz w:val="19"/>
+          <w:szCs w:val="19"/>
+          <w:rFonts w:ascii="Consolas" w:cs="Consolas" w:eastAsia="Consolas" w:hAnsi="Consolas"/>
+          <w:shd w:fill="EEF1F5" w:color="auto" w:val="clear"/>
+        </w:rPr>
+        <w:t xml:space="preserve">string(credentialsId: 'slack-webhook')</w:t>
+      </w:r>
+      <w:r>
+        <w:rPr>
+          <w:rFonts w:ascii="Calibri" w:cs="Calibri" w:eastAsia="Calibri" w:hAnsi="Calibri"/>
+        </w:rPr>
+        <w:t xml:space="preserve"> use padh nahi payega.</w:t>
+      </w:r>
+    </w:p>
+    <w:p>
+      <w:pPr>
+        <w:pBdr>
+          <w:left w:val="single" w:color="E8A33D" w:sz="18" w:space="8"/>
+        </w:pBdr>
+        <w:shd w:fill="FFF8E6" w:color="auto" w:val="clear"/>
+        <w:spacing w:before="60" w:after="60"/>
+        <w:ind w:left="240"/>
+      </w:pPr>
+      <w:r>
+        <w:rPr>
+          <w:b/>
+          <w:bCs/>
+          <w:rFonts w:ascii="Calibri" w:cs="Calibri" w:eastAsia="Calibri" w:hAnsi="Calibri"/>
+        </w:rPr>
+        <w:t xml:space="preserve">Kyun:</w:t>
+      </w:r>
+      <w:r>
+        <w:rPr>
+          <w:rFonts w:ascii="Calibri" w:cs="Calibri" w:eastAsia="Calibri" w:hAnsi="Calibri"/>
+        </w:rPr>
+        <w:t xml:space="preserve"> Secret text Jenkins mein encrypted rehta hai, aur log mein galti se print ho to bhi </w:t>
+      </w:r>
+      <w:r>
+        <w:rPr>
+          <w:color w:val="B0306A"/>
+          <w:sz w:val="19"/>
+          <w:szCs w:val="19"/>
+          <w:rFonts w:ascii="Consolas" w:cs="Consolas" w:eastAsia="Consolas" w:hAnsi="Consolas"/>
+          <w:shd w:fill="EEF1F5" w:color="auto" w:val="clear"/>
+        </w:rPr>
+        <w:t xml:space="preserve">****</w:t>
+      </w:r>
+      <w:r>
+        <w:rPr>
+          <w:rFonts w:ascii="Calibri" w:cs="Calibri" w:eastAsia="Calibri" w:hAnsi="Calibri"/>
+        </w:rPr>
+        <w:t xml:space="preserve"> (masking). </w:t>
+      </w:r>
+      <w:r>
+        <w:rPr>
+          <w:color w:val="B0306A"/>
+          <w:sz w:val="19"/>
+          <w:szCs w:val="19"/>
+          <w:rFonts w:ascii="Consolas" w:cs="Consolas" w:eastAsia="Consolas" w:hAnsi="Consolas"/>
+          <w:shd w:fill="EEF1F5" w:color="auto" w:val="clear"/>
+        </w:rPr>
+        <w:t xml:space="preserve">notifySlack()</w:t>
+      </w:r>
+      <w:r>
+        <w:rPr>
+          <w:rFonts w:ascii="Calibri" w:cs="Calibri" w:eastAsia="Calibri" w:hAnsi="Calibri"/>
+        </w:rPr>
+        <w:t xml:space="preserve"> best-effort hai (</w:t>
+      </w:r>
+      <w:r>
+        <w:rPr>
+          <w:color w:val="B0306A"/>
+          <w:sz w:val="19"/>
+          <w:szCs w:val="19"/>
+          <w:rFonts w:ascii="Consolas" w:cs="Consolas" w:eastAsia="Consolas" w:hAnsi="Consolas"/>
+          <w:shd w:fill="EEF1F5" w:color="auto" w:val="clear"/>
+        </w:rPr>
+        <w:t xml:space="preserve">try/catch</w:t>
+      </w:r>
+      <w:r>
+        <w:rPr>
+          <w:rFonts w:ascii="Calibri" w:cs="Calibri" w:eastAsia="Calibri" w:hAnsi="Calibri"/>
+        </w:rPr>
+        <w:t xml:space="preserve">), to Slack down ho tab bhi deploy nahi rukta. Alag channel (</w:t>
+      </w:r>
+      <w:r>
+        <w:rPr>
+          <w:color w:val="B0306A"/>
+          <w:sz w:val="19"/>
+          <w:szCs w:val="19"/>
+          <w:rFonts w:ascii="Consolas" w:cs="Consolas" w:eastAsia="Consolas" w:hAnsi="Consolas"/>
+          <w:shd w:fill="EEF1F5" w:color="auto" w:val="clear"/>
+        </w:rPr>
+        <w:t xml:space="preserve">#deployment</w:t>
+      </w:r>
+      <w:r>
+        <w:rPr>
+          <w:rFonts w:ascii="Calibri" w:cs="Calibri" w:eastAsia="Calibri" w:hAnsi="Calibri"/>
+        </w:rPr>
+        <w:t xml:space="preserve"> vs </w:t>
+      </w:r>
+      <w:r>
+        <w:rPr>
+          <w:color w:val="B0306A"/>
+          <w:sz w:val="19"/>
+          <w:szCs w:val="19"/>
+          <w:rFonts w:ascii="Consolas" w:cs="Consolas" w:eastAsia="Consolas" w:hAnsi="Consolas"/>
+          <w:shd w:fill="EEF1F5" w:color="auto" w:val="clear"/>
+        </w:rPr>
+        <w:t xml:space="preserve">#alerts-dev</w:t>
+      </w:r>
+      <w:r>
+        <w:rPr>
+          <w:rFonts w:ascii="Calibri" w:cs="Calibri" w:eastAsia="Calibri" w:hAnsi="Calibri"/>
+        </w:rPr>
+        <w:t xml:space="preserve">): jaankari vs action. Mix kiya to alert fatigue.</w:t>
+      </w:r>
+    </w:p>
+    <w:p>
+      <w:pPr>
+        <w:spacing w:after="60"/>
+      </w:pPr>
+    </w:p>
+    <w:p>
+      <w:pPr>
+        <w:spacing w:after="120"/>
+      </w:pPr>
+      <w:r>
+        <w:rPr>
+          <w:rFonts w:ascii="Calibri" w:cs="Calibri" w:eastAsia="Calibri" w:hAnsi="Calibri"/>
+        </w:rPr>
+        <w:t xml:space="preserve">Ye optional hai. Credential nahi hoga to pipeline chalti rahegi, bas log mein "Slack notification skipped" aayega.</w:t>
       </w:r>
     </w:p>
     <w:p>
@@ -35281,7 +35975,83 @@
         <w:rPr>
           <w:rFonts w:ascii="Calibri" w:cs="Calibri" w:eastAsia="Calibri" w:hAnsi="Calibri"/>
         </w:rPr>
-        <w:t xml:space="preserve">G4. Alert ka safar: metric se Slack tak</w:t>
+        <w:t xml:space="preserve">G3. CloudWatch email alerts (SNS)</w:t>
+      </w:r>
+    </w:p>
+    <w:p>
+      <w:pPr>
+        <w:spacing w:after="120"/>
+      </w:pPr>
+      <w:r>
+        <w:rPr>
+          <w:color w:val="B0306A"/>
+          <w:sz w:val="19"/>
+          <w:szCs w:val="19"/>
+          <w:rFonts w:ascii="Consolas" w:cs="Consolas" w:eastAsia="Consolas" w:hAnsi="Consolas"/>
+          <w:shd w:fill="EEF1F5" w:color="auto" w:val="clear"/>
+        </w:rPr>
+        <w:t xml:space="preserve">terraform apply</w:t>
+      </w:r>
+      <w:r>
+        <w:rPr>
+          <w:rFonts w:ascii="Calibri" w:cs="Calibri" w:eastAsia="Calibri" w:hAnsi="Calibri"/>
+        </w:rPr>
+        <w:t xml:space="preserve"> (shared stack) ke baad AWS tere </w:t>
+      </w:r>
+      <w:r>
+        <w:rPr>
+          <w:color w:val="B0306A"/>
+          <w:sz w:val="19"/>
+          <w:szCs w:val="19"/>
+          <w:rFonts w:ascii="Consolas" w:cs="Consolas" w:eastAsia="Consolas" w:hAnsi="Consolas"/>
+          <w:shd w:fill="EEF1F5" w:color="auto" w:val="clear"/>
+        </w:rPr>
+        <w:t xml:space="preserve">alert_email</w:t>
+      </w:r>
+      <w:r>
+        <w:rPr>
+          <w:rFonts w:ascii="Calibri" w:cs="Calibri" w:eastAsia="Calibri" w:hAnsi="Calibri"/>
+        </w:rPr>
+        <w:t xml:space="preserve"> pe </w:t>
+      </w:r>
+      <w:r>
+        <w:rPr>
+          <w:b/>
+          <w:bCs/>
+          <w:rFonts w:ascii="Calibri" w:cs="Calibri" w:eastAsia="Calibri" w:hAnsi="Calibri"/>
+        </w:rPr>
+        <w:t xml:space="preserve">"AWS Notification - Subscription Confirmation"</w:t>
+      </w:r>
+      <w:r>
+        <w:rPr>
+          <w:rFonts w:ascii="Calibri" w:cs="Calibri" w:eastAsia="Calibri" w:hAnsi="Calibri"/>
+        </w:rPr>
+        <w:t xml:space="preserve"> mail bhejta hai. </w:t>
+      </w:r>
+      <w:r>
+        <w:rPr>
+          <w:b/>
+          <w:bCs/>
+          <w:rFonts w:ascii="Calibri" w:cs="Calibri" w:eastAsia="Calibri" w:hAnsi="Calibri"/>
+        </w:rPr>
+        <w:t xml:space="preserve">"Confirm subscription" link pe click kar</w:t>
+      </w:r>
+      <w:r>
+        <w:rPr>
+          <w:rFonts w:ascii="Calibri" w:cs="Calibri" w:eastAsia="Calibri" w:hAnsi="Calibri"/>
+        </w:rPr>
+        <w:t xml:space="preserve">, warna ek bhi email nahi aayega. Spam folder bhi check kar.</w:t>
+      </w:r>
+    </w:p>
+    <w:p>
+      <w:pPr>
+        <w:spacing w:after="120"/>
+      </w:pPr>
+      <w:r>
+        <w:rPr>
+          <w:rFonts w:ascii="Calibri" w:cs="Calibri" w:eastAsia="Calibri" w:hAnsi="Calibri"/>
+        </w:rPr>
+        <w:t xml:space="preserve">Check:</w:t>
       </w:r>
     </w:p>
     <w:p>
@@ -35302,127 +36072,7 @@
           <w:szCs w:val="16"/>
           <w:rFonts w:ascii="Consolas" w:cs="Consolas" w:eastAsia="Consolas" w:hAnsi="Consolas"/>
         </w:rPr>
-        <w:t xml:space="preserve">1. App har request ka metric expose karta hai  →  http_server_requests_seconds_count{status="500",...}</w:t>
-      </w:r>
-    </w:p>
-    <w:p>
-      <w:pPr>
-        <w:keepLines/>
-        <w:pBdr>
-          <w:left w:val="single" w:color="C9D1DB" w:sz="4" w:space="4"/>
-          <w:right w:val="single" w:color="C9D1DB" w:sz="4" w:space="4"/>
-        </w:pBdr>
-        <w:shd w:fill="F4F6F8" w:color="auto" w:val="clear"/>
-        <w:spacing w:before="0" w:after="0" w:line="240"/>
-      </w:pPr>
-      <w:r>
-        <w:rPr>
-          <w:color w:val="1E1E1E"/>
-          <w:sz w:val="16"/>
-          <w:szCs w:val="16"/>
-          <w:rFonts w:ascii="Consolas" w:cs="Consolas" w:eastAsia="Consolas" w:hAnsi="Consolas"/>
-        </w:rPr>
-        <w:t xml:space="preserve">2. Prometheus har 15s scrape karta hai (ServiceMonitor batata hai kahan se)</w:t>
-      </w:r>
-    </w:p>
-    <w:p>
-      <w:pPr>
-        <w:keepLines/>
-        <w:pBdr>
-          <w:left w:val="single" w:color="C9D1DB" w:sz="4" w:space="4"/>
-          <w:right w:val="single" w:color="C9D1DB" w:sz="4" w:space="4"/>
-        </w:pBdr>
-        <w:shd w:fill="F4F6F8" w:color="auto" w:val="clear"/>
-        <w:spacing w:before="0" w:after="0" w:line="240"/>
-      </w:pPr>
-      <w:r>
-        <w:rPr>
-          <w:color w:val="1E1E1E"/>
-          <w:sz w:val="16"/>
-          <w:szCs w:val="16"/>
-          <w:rFonts w:ascii="Consolas" w:cs="Consolas" w:eastAsia="Consolas" w:hAnsi="Consolas"/>
-        </w:rPr>
-        <w:t xml:space="preserve">3. Recording rules har 30s SLI calculate karte hain  →  slo:sli_error:ratio_rate5m, ..._1h, ..._6h ...</w:t>
-      </w:r>
-    </w:p>
-    <w:p>
-      <w:pPr>
-        <w:keepLines/>
-        <w:pBdr>
-          <w:left w:val="single" w:color="C9D1DB" w:sz="4" w:space="4"/>
-          <w:right w:val="single" w:color="C9D1DB" w:sz="4" w:space="4"/>
-        </w:pBdr>
-        <w:shd w:fill="F4F6F8" w:color="auto" w:val="clear"/>
-        <w:spacing w:before="0" w:after="0" w:line="240"/>
-      </w:pPr>
-      <w:r>
-        <w:rPr>
-          <w:color w:val="1E1E1E"/>
-          <w:sz w:val="16"/>
-          <w:szCs w:val="16"/>
-          <w:rFonts w:ascii="Consolas" w:cs="Consolas" w:eastAsia="Consolas" w:hAnsi="Consolas"/>
-        </w:rPr>
-        <w:t xml:space="preserve">4. Alert rule condition true + "for" time poora  →  alert FIRING</w:t>
-      </w:r>
-    </w:p>
-    <w:p>
-      <w:pPr>
-        <w:keepLines/>
-        <w:pBdr>
-          <w:left w:val="single" w:color="C9D1DB" w:sz="4" w:space="4"/>
-          <w:right w:val="single" w:color="C9D1DB" w:sz="4" w:space="4"/>
-        </w:pBdr>
-        <w:shd w:fill="F4F6F8" w:color="auto" w:val="clear"/>
-        <w:spacing w:before="0" w:after="0" w:line="240"/>
-      </w:pPr>
-      <w:r>
-        <w:rPr>
-          <w:color w:val="1E1E1E"/>
-          <w:sz w:val="16"/>
-          <w:szCs w:val="16"/>
-          <w:rFonts w:ascii="Consolas" w:cs="Consolas" w:eastAsia="Consolas" w:hAnsi="Consolas"/>
-        </w:rPr>
-        <w:t xml:space="preserve">5. Prometheus alert Alertmanager ko bhejta hai (label cluster=dev/staging/prod jud jaata hai)</w:t>
-      </w:r>
-    </w:p>
-    <w:p>
-      <w:pPr>
-        <w:keepLines/>
-        <w:pBdr>
-          <w:left w:val="single" w:color="C9D1DB" w:sz="4" w:space="4"/>
-          <w:right w:val="single" w:color="C9D1DB" w:sz="4" w:space="4"/>
-        </w:pBdr>
-        <w:shd w:fill="F4F6F8" w:color="auto" w:val="clear"/>
-        <w:spacing w:before="0" w:after="0" w:line="240"/>
-      </w:pPr>
-      <w:r>
-        <w:rPr>
-          <w:color w:val="1E1E1E"/>
-          <w:sz w:val="16"/>
-          <w:szCs w:val="16"/>
-          <w:rFonts w:ascii="Consolas" w:cs="Consolas" w:eastAsia="Consolas" w:hAnsi="Consolas"/>
-        </w:rPr>
-        <w:t xml:space="preserve">6. Alertmanager: GROUP (milte-julte alerts ek message mein) → INHIBIT (duplicate/noise dabao)</w:t>
-      </w:r>
-    </w:p>
-    <w:p>
-      <w:pPr>
-        <w:keepLines/>
-        <w:pBdr>
-          <w:left w:val="single" w:color="C9D1DB" w:sz="4" w:space="4"/>
-          <w:right w:val="single" w:color="C9D1DB" w:sz="4" w:space="4"/>
-        </w:pBdr>
-        <w:shd w:fill="F4F6F8" w:color="auto" w:val="clear"/>
-        <w:spacing w:before="0" w:after="0" w:line="240"/>
-      </w:pPr>
-      <w:r>
-        <w:rPr>
-          <w:color w:val="1E1E1E"/>
-          <w:sz w:val="16"/>
-          <w:szCs w:val="16"/>
-          <w:rFonts w:ascii="Consolas" w:cs="Consolas" w:eastAsia="Consolas" w:hAnsi="Consolas"/>
-        </w:rPr>
-        <w:t xml:space="preserve">                 → ROUTE (severity ke hisaab se receiver) → Slack</w:t>
+        <w:t xml:space="preserve">aws sns list-subscriptions --query "Subscriptions[?contains(TopicArn,'order-platform-alerts')].[Endpoint,SubscriptionArn]" --output table</w:t>
       </w:r>
     </w:p>
     <w:p>
@@ -35443,6 +36093,180 @@
           <w:szCs w:val="16"/>
           <w:rFonts w:ascii="Consolas" w:cs="Consolas" w:eastAsia="Consolas" w:hAnsi="Consolas"/>
         </w:rPr>
+        <w:t xml:space="preserve"># SubscriptionArn "PendingConfirmation" hai to abhi confirm nahi hua</w:t>
+      </w:r>
+    </w:p>
+    <w:p>
+      <w:pPr>
+        <w:pStyle w:val="Heading3"/>
+        <w:keepNext/>
+      </w:pPr>
+      <w:r>
+        <w:rPr>
+          <w:rFonts w:ascii="Calibri" w:cs="Calibri" w:eastAsia="Calibri" w:hAnsi="Calibri"/>
+        </w:rPr>
+        <w:t xml:space="preserve">G4. Alert ka safar: metric se Slack tak</w:t>
+      </w:r>
+    </w:p>
+    <w:p>
+      <w:pPr>
+        <w:keepLines/>
+        <w:pBdr>
+          <w:top w:val="single" w:color="C9D1DB" w:sz="4" w:space="4"/>
+          <w:left w:val="single" w:color="C9D1DB" w:sz="4" w:space="4"/>
+          <w:right w:val="single" w:color="C9D1DB" w:sz="4" w:space="4"/>
+        </w:pBdr>
+        <w:shd w:fill="F4F6F8" w:color="auto" w:val="clear"/>
+        <w:spacing w:before="80" w:after="0" w:line="240"/>
+      </w:pPr>
+      <w:r>
+        <w:rPr>
+          <w:color w:val="1E1E1E"/>
+          <w:sz w:val="16"/>
+          <w:szCs w:val="16"/>
+          <w:rFonts w:ascii="Consolas" w:cs="Consolas" w:eastAsia="Consolas" w:hAnsi="Consolas"/>
+        </w:rPr>
+        <w:t xml:space="preserve">1. App har request ka metric expose karta hai  →  http_server_requests_seconds_count{status="500",...}</w:t>
+      </w:r>
+    </w:p>
+    <w:p>
+      <w:pPr>
+        <w:keepLines/>
+        <w:pBdr>
+          <w:left w:val="single" w:color="C9D1DB" w:sz="4" w:space="4"/>
+          <w:right w:val="single" w:color="C9D1DB" w:sz="4" w:space="4"/>
+        </w:pBdr>
+        <w:shd w:fill="F4F6F8" w:color="auto" w:val="clear"/>
+        <w:spacing w:before="0" w:after="0" w:line="240"/>
+      </w:pPr>
+      <w:r>
+        <w:rPr>
+          <w:color w:val="1E1E1E"/>
+          <w:sz w:val="16"/>
+          <w:szCs w:val="16"/>
+          <w:rFonts w:ascii="Consolas" w:cs="Consolas" w:eastAsia="Consolas" w:hAnsi="Consolas"/>
+        </w:rPr>
+        <w:t xml:space="preserve">2. Prometheus har 15s scrape karta hai (ServiceMonitor batata hai kahan se)</w:t>
+      </w:r>
+    </w:p>
+    <w:p>
+      <w:pPr>
+        <w:keepLines/>
+        <w:pBdr>
+          <w:left w:val="single" w:color="C9D1DB" w:sz="4" w:space="4"/>
+          <w:right w:val="single" w:color="C9D1DB" w:sz="4" w:space="4"/>
+        </w:pBdr>
+        <w:shd w:fill="F4F6F8" w:color="auto" w:val="clear"/>
+        <w:spacing w:before="0" w:after="0" w:line="240"/>
+      </w:pPr>
+      <w:r>
+        <w:rPr>
+          <w:color w:val="1E1E1E"/>
+          <w:sz w:val="16"/>
+          <w:szCs w:val="16"/>
+          <w:rFonts w:ascii="Consolas" w:cs="Consolas" w:eastAsia="Consolas" w:hAnsi="Consolas"/>
+        </w:rPr>
+        <w:t xml:space="preserve">3. Recording rules har 30s SLI calculate karte hain  →  slo:sli_error:ratio_rate5m, ..._1h, ..._6h ...</w:t>
+      </w:r>
+    </w:p>
+    <w:p>
+      <w:pPr>
+        <w:keepLines/>
+        <w:pBdr>
+          <w:left w:val="single" w:color="C9D1DB" w:sz="4" w:space="4"/>
+          <w:right w:val="single" w:color="C9D1DB" w:sz="4" w:space="4"/>
+        </w:pBdr>
+        <w:shd w:fill="F4F6F8" w:color="auto" w:val="clear"/>
+        <w:spacing w:before="0" w:after="0" w:line="240"/>
+      </w:pPr>
+      <w:r>
+        <w:rPr>
+          <w:color w:val="1E1E1E"/>
+          <w:sz w:val="16"/>
+          <w:szCs w:val="16"/>
+          <w:rFonts w:ascii="Consolas" w:cs="Consolas" w:eastAsia="Consolas" w:hAnsi="Consolas"/>
+        </w:rPr>
+        <w:t xml:space="preserve">4. Alert rule condition true + "for" time poora  →  alert FIRING</w:t>
+      </w:r>
+    </w:p>
+    <w:p>
+      <w:pPr>
+        <w:keepLines/>
+        <w:pBdr>
+          <w:left w:val="single" w:color="C9D1DB" w:sz="4" w:space="4"/>
+          <w:right w:val="single" w:color="C9D1DB" w:sz="4" w:space="4"/>
+        </w:pBdr>
+        <w:shd w:fill="F4F6F8" w:color="auto" w:val="clear"/>
+        <w:spacing w:before="0" w:after="0" w:line="240"/>
+      </w:pPr>
+      <w:r>
+        <w:rPr>
+          <w:color w:val="1E1E1E"/>
+          <w:sz w:val="16"/>
+          <w:szCs w:val="16"/>
+          <w:rFonts w:ascii="Consolas" w:cs="Consolas" w:eastAsia="Consolas" w:hAnsi="Consolas"/>
+        </w:rPr>
+        <w:t xml:space="preserve">5. Prometheus alert Alertmanager ko bhejta hai (label cluster=dev/staging/prod jud jaata hai)</w:t>
+      </w:r>
+    </w:p>
+    <w:p>
+      <w:pPr>
+        <w:keepLines/>
+        <w:pBdr>
+          <w:left w:val="single" w:color="C9D1DB" w:sz="4" w:space="4"/>
+          <w:right w:val="single" w:color="C9D1DB" w:sz="4" w:space="4"/>
+        </w:pBdr>
+        <w:shd w:fill="F4F6F8" w:color="auto" w:val="clear"/>
+        <w:spacing w:before="0" w:after="0" w:line="240"/>
+      </w:pPr>
+      <w:r>
+        <w:rPr>
+          <w:color w:val="1E1E1E"/>
+          <w:sz w:val="16"/>
+          <w:szCs w:val="16"/>
+          <w:rFonts w:ascii="Consolas" w:cs="Consolas" w:eastAsia="Consolas" w:hAnsi="Consolas"/>
+        </w:rPr>
+        <w:t xml:space="preserve">6. Alertmanager: GROUP (milte-julte alerts ek message mein) → INHIBIT (duplicate/noise dabao)</w:t>
+      </w:r>
+    </w:p>
+    <w:p>
+      <w:pPr>
+        <w:keepLines/>
+        <w:pBdr>
+          <w:left w:val="single" w:color="C9D1DB" w:sz="4" w:space="4"/>
+          <w:right w:val="single" w:color="C9D1DB" w:sz="4" w:space="4"/>
+        </w:pBdr>
+        <w:shd w:fill="F4F6F8" w:color="auto" w:val="clear"/>
+        <w:spacing w:before="0" w:after="0" w:line="240"/>
+      </w:pPr>
+      <w:r>
+        <w:rPr>
+          <w:color w:val="1E1E1E"/>
+          <w:sz w:val="16"/>
+          <w:szCs w:val="16"/>
+          <w:rFonts w:ascii="Consolas" w:cs="Consolas" w:eastAsia="Consolas" w:hAnsi="Consolas"/>
+        </w:rPr>
+        <w:t xml:space="preserve">                 → ROUTE (severity ke hisaab se receiver) → Slack</w:t>
+      </w:r>
+    </w:p>
+    <w:p>
+      <w:pPr>
+        <w:keepLines/>
+        <w:pBdr>
+          <w:left w:val="single" w:color="C9D1DB" w:sz="4" w:space="4"/>
+          <w:bottom w:val="single" w:color="C9D1DB" w:sz="4" w:space="4"/>
+          <w:right w:val="single" w:color="C9D1DB" w:sz="4" w:space="4"/>
+        </w:pBdr>
+        <w:shd w:fill="F4F6F8" w:color="auto" w:val="clear"/>
+        <w:spacing w:before="0" w:after="160" w:line="240"/>
+      </w:pPr>
+      <w:r>
+        <w:rPr>
+          <w:color w:val="1E1E1E"/>
+          <w:sz w:val="16"/>
+          <w:szCs w:val="16"/>
+          <w:rFonts w:ascii="Consolas" w:cs="Consolas" w:eastAsia="Consolas" w:hAnsi="Consolas"/>
+        </w:rPr>
         <w:t xml:space="preserve">7. Problem theek hui  →  RESOLVED message (send_resolved: true)</w:t>
       </w:r>
     </w:p>
@@ -35482,7 +36306,7 @@
         <w:pStyle w:val="ListParagraph"/>
         <w:numPr>
           <w:ilvl w:val="0"/>
-          <w:numId w:val="38"/>
+          <w:numId w:val="39"/>
         </w:numPr>
         <w:spacing w:before="20" w:after="40"/>
       </w:pPr>
@@ -35498,7 +36322,7 @@
         <w:pStyle w:val="ListParagraph"/>
         <w:numPr>
           <w:ilvl w:val="0"/>
-          <w:numId w:val="38"/>
+          <w:numId w:val="39"/>
         </w:numPr>
         <w:spacing w:before="20" w:after="40"/>
       </w:pPr>
@@ -37002,7 +37826,7 @@
         <w:pStyle w:val="ListParagraph"/>
         <w:numPr>
           <w:ilvl w:val="0"/>
-          <w:numId w:val="39"/>
+          <w:numId w:val="40"/>
         </w:numPr>
         <w:spacing w:before="20" w:after="40"/>
       </w:pPr>
@@ -37019,57 +37843,6 @@
           <w:rFonts w:ascii="Calibri" w:cs="Calibri" w:eastAsia="Calibri" w:hAnsi="Calibri"/>
         </w:rPr>
         <w:t xml:space="preserve"> pakka karta hai ki problem asli hai, blip nahi.</w:t>
-      </w:r>
-    </w:p>
-    <w:p>
-      <w:pPr>
-        <w:pStyle w:val="ListParagraph"/>
-        <w:numPr>
-          <w:ilvl w:val="0"/>
-          <w:numId w:val="39"/>
-        </w:numPr>
-        <w:spacing w:before="20" w:after="40"/>
-      </w:pPr>
-      <w:r>
-        <w:rPr>
-          <w:b/>
-          <w:bCs/>
-          <w:rFonts w:ascii="Calibri" w:cs="Calibri" w:eastAsia="Calibri" w:hAnsi="Calibri"/>
-        </w:rPr>
-        <w:t xml:space="preserve">Short window</w:t>
-      </w:r>
-      <w:r>
-        <w:rPr>
-          <w:rFonts w:ascii="Calibri" w:cs="Calibri" w:eastAsia="Calibri" w:hAnsi="Calibri"/>
-        </w:rPr>
-        <w:t xml:space="preserve"> pakka karta hai ki problem </w:t>
-      </w:r>
-      <w:r>
-        <w:rPr>
-          <w:i/>
-          <w:iCs/>
-          <w:rFonts w:ascii="Calibri" w:cs="Calibri" w:eastAsia="Calibri" w:hAnsi="Calibri"/>
-        </w:rPr>
-        <w:t xml:space="preserve">abhi bhi</w:t>
-      </w:r>
-      <w:r>
-        <w:rPr>
-          <w:rFonts w:ascii="Calibri" w:cs="Calibri" w:eastAsia="Calibri" w:hAnsi="Calibri"/>
-        </w:rPr>
-        <w:t xml:space="preserve"> chal rahi hai. Fix hone ke baad alert jaldi resolve hota hai, ghanton latka nahi rehta.</w:t>
-      </w:r>
-    </w:p>
-    <w:p>
-      <w:pPr>
-        <w:spacing w:after="120"/>
-      </w:pPr>
-      <w:r>
-        <w:rPr>
-          <w:b/>
-          <w:bCs/>
-          <w:rFonts w:ascii="Calibri" w:cs="Calibri" w:eastAsia="Calibri" w:hAnsi="Calibri"/>
-        </w:rPr>
-        <w:t xml:space="preserve">Baaki "smart" alerts:</w:t>
       </w:r>
     </w:p>
     <w:p>
@@ -37083,6 +37856,57 @@
       </w:pPr>
       <w:r>
         <w:rPr>
+          <w:b/>
+          <w:bCs/>
+          <w:rFonts w:ascii="Calibri" w:cs="Calibri" w:eastAsia="Calibri" w:hAnsi="Calibri"/>
+        </w:rPr>
+        <w:t xml:space="preserve">Short window</w:t>
+      </w:r>
+      <w:r>
+        <w:rPr>
+          <w:rFonts w:ascii="Calibri" w:cs="Calibri" w:eastAsia="Calibri" w:hAnsi="Calibri"/>
+        </w:rPr>
+        <w:t xml:space="preserve"> pakka karta hai ki problem </w:t>
+      </w:r>
+      <w:r>
+        <w:rPr>
+          <w:i/>
+          <w:iCs/>
+          <w:rFonts w:ascii="Calibri" w:cs="Calibri" w:eastAsia="Calibri" w:hAnsi="Calibri"/>
+        </w:rPr>
+        <w:t xml:space="preserve">abhi bhi</w:t>
+      </w:r>
+      <w:r>
+        <w:rPr>
+          <w:rFonts w:ascii="Calibri" w:cs="Calibri" w:eastAsia="Calibri" w:hAnsi="Calibri"/>
+        </w:rPr>
+        <w:t xml:space="preserve"> chal rahi hai. Fix hone ke baad alert jaldi resolve hota hai, ghanton latka nahi rehta.</w:t>
+      </w:r>
+    </w:p>
+    <w:p>
+      <w:pPr>
+        <w:spacing w:after="120"/>
+      </w:pPr>
+      <w:r>
+        <w:rPr>
+          <w:b/>
+          <w:bCs/>
+          <w:rFonts w:ascii="Calibri" w:cs="Calibri" w:eastAsia="Calibri" w:hAnsi="Calibri"/>
+        </w:rPr>
+        <w:t xml:space="preserve">Baaki "smart" alerts:</w:t>
+      </w:r>
+    </w:p>
+    <w:p>
+      <w:pPr>
+        <w:pStyle w:val="ListParagraph"/>
+        <w:numPr>
+          <w:ilvl w:val="0"/>
+          <w:numId w:val="41"/>
+        </w:numPr>
+        <w:spacing w:before="20" w:after="40"/>
+      </w:pPr>
+      <w:r>
+        <w:rPr>
           <w:color w:val="B0306A"/>
           <w:sz w:val="19"/>
           <w:szCs w:val="19"/>
@@ -37133,7 +37957,7 @@
         <w:pStyle w:val="ListParagraph"/>
         <w:numPr>
           <w:ilvl w:val="0"/>
-          <w:numId w:val="40"/>
+          <w:numId w:val="41"/>
         </w:numPr>
         <w:spacing w:before="20" w:after="40"/>
       </w:pPr>
@@ -37173,7 +37997,7 @@
         <w:pStyle w:val="ListParagraph"/>
         <w:numPr>
           <w:ilvl w:val="0"/>
-          <w:numId w:val="40"/>
+          <w:numId w:val="41"/>
         </w:numPr>
         <w:spacing w:before="20" w:after="40"/>
       </w:pPr>
@@ -39856,7 +40680,7 @@
         <w:pStyle w:val="ListParagraph"/>
         <w:numPr>
           <w:ilvl w:val="0"/>
-          <w:numId w:val="41"/>
+          <w:numId w:val="42"/>
         </w:numPr>
         <w:spacing w:before="20" w:after="40"/>
       </w:pPr>
@@ -39879,157 +40703,6 @@
           <w:rFonts w:ascii="Calibri" w:cs="Calibri" w:eastAsia="Calibri" w:hAnsi="Calibri"/>
         </w:rPr>
         <w:t xml:space="preserve">, Requests/s, p95 latency, Ready pods, Canary phase</w:t>
-      </w:r>
-    </w:p>
-    <w:p>
-      <w:pPr>
-        <w:pStyle w:val="ListParagraph"/>
-        <w:numPr>
-          <w:ilvl w:val="0"/>
-          <w:numId w:val="41"/>
-        </w:numPr>
-        <w:spacing w:before="20" w:after="40"/>
-      </w:pPr>
-      <w:r>
-        <w:rPr>
-          <w:rFonts w:ascii="Calibri" w:cs="Calibri" w:eastAsia="Calibri" w:hAnsi="Calibri"/>
-        </w:rPr>
-        <w:t xml:space="preserve">RED: requests by status, 5xx ratio vs SLO line, latency p50/p95/p99 vs 300ms line</w:t>
-      </w:r>
-    </w:p>
-    <w:p>
-      <w:pPr>
-        <w:pStyle w:val="ListParagraph"/>
-        <w:numPr>
-          <w:ilvl w:val="0"/>
-          <w:numId w:val="41"/>
-        </w:numPr>
-        <w:spacing w:before="20" w:after="40"/>
-      </w:pPr>
-      <w:r>
-        <w:rPr>
-          <w:b/>
-          <w:bCs/>
-          <w:rFonts w:ascii="Calibri" w:cs="Calibri" w:eastAsia="Calibri" w:hAnsi="Calibri"/>
-        </w:rPr>
-        <w:t xml:space="preserve">Burn rate graph</w:t>
-      </w:r>
-      <w:r>
-        <w:rPr>
-          <w:rFonts w:ascii="Calibri" w:cs="Calibri" w:eastAsia="Calibri" w:hAnsi="Calibri"/>
-        </w:rPr>
-        <w:t xml:space="preserve"> with 6x / 14.4x lines (alert kyun aaya, ye dikhta hai)</w:t>
-      </w:r>
-    </w:p>
-    <w:p>
-      <w:pPr>
-        <w:pStyle w:val="ListParagraph"/>
-        <w:numPr>
-          <w:ilvl w:val="0"/>
-          <w:numId w:val="41"/>
-        </w:numPr>
-        <w:spacing w:before="20" w:after="40"/>
-      </w:pPr>
-      <w:r>
-        <w:rPr>
-          <w:rFonts w:ascii="Calibri" w:cs="Calibri" w:eastAsia="Calibri" w:hAnsi="Calibri"/>
-        </w:rPr>
-        <w:t xml:space="preserve">Business: orders/min. JVM heap, CPU, memory vs limit, restarts. Firing alerts table.</w:t>
-      </w:r>
-    </w:p>
-    <w:p>
-      <w:pPr>
-        <w:pStyle w:val="ListParagraph"/>
-        <w:numPr>
-          <w:ilvl w:val="0"/>
-          <w:numId w:val="41"/>
-        </w:numPr>
-        <w:spacing w:before="20" w:after="40"/>
-      </w:pPr>
-      <w:r>
-        <w:rPr>
-          <w:rFonts w:ascii="Calibri" w:cs="Calibri" w:eastAsia="Calibri" w:hAnsi="Calibri"/>
-        </w:rPr>
-        <w:t xml:space="preserve">🟠 </w:t>
-      </w:r>
-      <w:r>
-        <w:rPr>
-          <w:b/>
-          <w:bCs/>
-          <w:rFonts w:ascii="Calibri" w:cs="Calibri" w:eastAsia="Calibri" w:hAnsi="Calibri"/>
-        </w:rPr>
-        <w:t xml:space="preserve">Deployment markers</w:t>
-      </w:r>
-      <w:r>
-        <w:rPr>
-          <w:rFonts w:ascii="Calibri" w:cs="Calibri" w:eastAsia="Calibri" w:hAnsi="Calibri"/>
-        </w:rPr>
-        <w:t xml:space="preserve">: har naye ReplicaSet (= naya release) pe graph pe orange line. Error spike release ke turant baad aaya? Ek nazar mein pata chal jaata hai.</w:t>
-      </w:r>
-    </w:p>
-    <w:p>
-      <w:pPr>
-        <w:pStyle w:val="ListParagraph"/>
-        <w:numPr>
-          <w:ilvl w:val="0"/>
-          <w:numId w:val="41"/>
-        </w:numPr>
-        <w:spacing w:before="20" w:after="40"/>
-      </w:pPr>
-      <w:r>
-        <w:rPr>
-          <w:rFonts w:ascii="Calibri" w:cs="Calibri" w:eastAsia="Calibri" w:hAnsi="Calibri"/>
-        </w:rPr>
-        <w:t xml:space="preserve">🔴 </w:t>
-      </w:r>
-      <w:r>
-        <w:rPr>
-          <w:b/>
-          <w:bCs/>
-          <w:rFonts w:ascii="Calibri" w:cs="Calibri" w:eastAsia="Calibri" w:hAnsi="Calibri"/>
-        </w:rPr>
-        <w:t xml:space="preserve">Alert markers</w:t>
-      </w:r>
-      <w:r>
-        <w:rPr>
-          <w:rFonts w:ascii="Calibri" w:cs="Calibri" w:eastAsia="Calibri" w:hAnsi="Calibri"/>
-        </w:rPr>
-        <w:t xml:space="preserve">: alert kab fire hua, wo bhi graph pe</w:t>
-      </w:r>
-    </w:p>
-    <w:p>
-      <w:pPr>
-        <w:spacing w:after="120"/>
-      </w:pPr>
-      <w:r>
-        <w:rPr>
-          <w:b/>
-          <w:bCs/>
-          <w:rFonts w:ascii="Calibri" w:cs="Calibri" w:eastAsia="Calibri" w:hAnsi="Calibri"/>
-        </w:rPr>
-        <w:t xml:space="preserve">2. Platform Overview</w:t>
-      </w:r>
-      <w:r>
-        <w:rPr>
-          <w:rFonts w:ascii="Calibri" w:cs="Calibri" w:eastAsia="Calibri" w:hAnsi="Calibri"/>
-        </w:rPr>
-        <w:t xml:space="preserve"> (</w:t>
-      </w:r>
-      <w:r>
-        <w:rPr>
-          <w:color w:val="B0306A"/>
-          <w:sz w:val="19"/>
-          <w:szCs w:val="19"/>
-          <w:rFonts w:ascii="Consolas" w:cs="Consolas" w:eastAsia="Consolas" w:hAnsi="Consolas"/>
-          <w:shd w:fill="EEF1F5" w:color="auto" w:val="clear"/>
-        </w:rPr>
-        <w:t xml:space="preserve">gitops/platform/monitoring/dashboards/platform-overview.json</w:t>
-      </w:r>
-      <w:r>
-        <w:rPr>
-          <w:rFonts w:ascii="Calibri" w:cs="Calibri" w:eastAsia="Calibri" w:hAnsi="Calibri"/>
-        </w:rPr>
-        <w:t xml:space="preserve">)</w:t>
       </w:r>
     </w:p>
     <w:p>
@@ -40045,7 +40718,7 @@
         <w:rPr>
           <w:rFonts w:ascii="Calibri" w:cs="Calibri" w:eastAsia="Calibri" w:hAnsi="Calibri"/>
         </w:rPr>
-        <w:t xml:space="preserve">Firing critical/warning count, nodes ready, Kyverno violations (24h)</w:t>
+        <w:t xml:space="preserve">RED: requests by status, 5xx ratio vs SLO line, latency p50/p95/p99 vs 300ms line</w:t>
       </w:r>
     </w:p>
     <w:p>
@@ -40059,9 +40732,17 @@
       </w:pPr>
       <w:r>
         <w:rPr>
-          <w:rFonts w:ascii="Calibri" w:cs="Calibri" w:eastAsia="Calibri" w:hAnsi="Calibri"/>
-        </w:rPr>
-        <w:t xml:space="preserve">Argo CD apps table (health + sync, colored), rollout phase timeline (canary kab abort hua)</w:t>
+          <w:b/>
+          <w:bCs/>
+          <w:rFonts w:ascii="Calibri" w:cs="Calibri" w:eastAsia="Calibri" w:hAnsi="Calibri"/>
+        </w:rPr>
+        <w:t xml:space="preserve">Burn rate graph</w:t>
+      </w:r>
+      <w:r>
+        <w:rPr>
+          <w:rFonts w:ascii="Calibri" w:cs="Calibri" w:eastAsia="Calibri" w:hAnsi="Calibri"/>
+        </w:rPr>
+        <w:t xml:space="preserve"> with 6x / 14.4x lines (alert kyun aaya, ye dikhta hai)</w:t>
       </w:r>
     </w:p>
     <w:p>
@@ -40070,6 +40751,149 @@
         <w:numPr>
           <w:ilvl w:val="0"/>
           <w:numId w:val="42"/>
+        </w:numPr>
+        <w:spacing w:before="20" w:after="40"/>
+      </w:pPr>
+      <w:r>
+        <w:rPr>
+          <w:rFonts w:ascii="Calibri" w:cs="Calibri" w:eastAsia="Calibri" w:hAnsi="Calibri"/>
+        </w:rPr>
+        <w:t xml:space="preserve">Business: orders/min. JVM heap, CPU, memory vs limit, restarts. Firing alerts table.</w:t>
+      </w:r>
+    </w:p>
+    <w:p>
+      <w:pPr>
+        <w:pStyle w:val="ListParagraph"/>
+        <w:numPr>
+          <w:ilvl w:val="0"/>
+          <w:numId w:val="42"/>
+        </w:numPr>
+        <w:spacing w:before="20" w:after="40"/>
+      </w:pPr>
+      <w:r>
+        <w:rPr>
+          <w:rFonts w:ascii="Calibri" w:cs="Calibri" w:eastAsia="Calibri" w:hAnsi="Calibri"/>
+        </w:rPr>
+        <w:t xml:space="preserve">🟠 </w:t>
+      </w:r>
+      <w:r>
+        <w:rPr>
+          <w:b/>
+          <w:bCs/>
+          <w:rFonts w:ascii="Calibri" w:cs="Calibri" w:eastAsia="Calibri" w:hAnsi="Calibri"/>
+        </w:rPr>
+        <w:t xml:space="preserve">Deployment markers</w:t>
+      </w:r>
+      <w:r>
+        <w:rPr>
+          <w:rFonts w:ascii="Calibri" w:cs="Calibri" w:eastAsia="Calibri" w:hAnsi="Calibri"/>
+        </w:rPr>
+        <w:t xml:space="preserve">: har naye ReplicaSet (= naya release) pe graph pe orange line. Error spike release ke turant baad aaya? Ek nazar mein pata chal jaata hai.</w:t>
+      </w:r>
+    </w:p>
+    <w:p>
+      <w:pPr>
+        <w:pStyle w:val="ListParagraph"/>
+        <w:numPr>
+          <w:ilvl w:val="0"/>
+          <w:numId w:val="42"/>
+        </w:numPr>
+        <w:spacing w:before="20" w:after="40"/>
+      </w:pPr>
+      <w:r>
+        <w:rPr>
+          <w:rFonts w:ascii="Calibri" w:cs="Calibri" w:eastAsia="Calibri" w:hAnsi="Calibri"/>
+        </w:rPr>
+        <w:t xml:space="preserve">🔴 </w:t>
+      </w:r>
+      <w:r>
+        <w:rPr>
+          <w:b/>
+          <w:bCs/>
+          <w:rFonts w:ascii="Calibri" w:cs="Calibri" w:eastAsia="Calibri" w:hAnsi="Calibri"/>
+        </w:rPr>
+        <w:t xml:space="preserve">Alert markers</w:t>
+      </w:r>
+      <w:r>
+        <w:rPr>
+          <w:rFonts w:ascii="Calibri" w:cs="Calibri" w:eastAsia="Calibri" w:hAnsi="Calibri"/>
+        </w:rPr>
+        <w:t xml:space="preserve">: alert kab fire hua, wo bhi graph pe</w:t>
+      </w:r>
+    </w:p>
+    <w:p>
+      <w:pPr>
+        <w:spacing w:after="120"/>
+      </w:pPr>
+      <w:r>
+        <w:rPr>
+          <w:b/>
+          <w:bCs/>
+          <w:rFonts w:ascii="Calibri" w:cs="Calibri" w:eastAsia="Calibri" w:hAnsi="Calibri"/>
+        </w:rPr>
+        <w:t xml:space="preserve">2. Platform Overview</w:t>
+      </w:r>
+      <w:r>
+        <w:rPr>
+          <w:rFonts w:ascii="Calibri" w:cs="Calibri" w:eastAsia="Calibri" w:hAnsi="Calibri"/>
+        </w:rPr>
+        <w:t xml:space="preserve"> (</w:t>
+      </w:r>
+      <w:r>
+        <w:rPr>
+          <w:color w:val="B0306A"/>
+          <w:sz w:val="19"/>
+          <w:szCs w:val="19"/>
+          <w:rFonts w:ascii="Consolas" w:cs="Consolas" w:eastAsia="Consolas" w:hAnsi="Consolas"/>
+          <w:shd w:fill="EEF1F5" w:color="auto" w:val="clear"/>
+        </w:rPr>
+        <w:t xml:space="preserve">gitops/platform/monitoring/dashboards/platform-overview.json</w:t>
+      </w:r>
+      <w:r>
+        <w:rPr>
+          <w:rFonts w:ascii="Calibri" w:cs="Calibri" w:eastAsia="Calibri" w:hAnsi="Calibri"/>
+        </w:rPr>
+        <w:t xml:space="preserve">)</w:t>
+      </w:r>
+    </w:p>
+    <w:p>
+      <w:pPr>
+        <w:pStyle w:val="ListParagraph"/>
+        <w:numPr>
+          <w:ilvl w:val="0"/>
+          <w:numId w:val="43"/>
+        </w:numPr>
+        <w:spacing w:before="20" w:after="40"/>
+      </w:pPr>
+      <w:r>
+        <w:rPr>
+          <w:rFonts w:ascii="Calibri" w:cs="Calibri" w:eastAsia="Calibri" w:hAnsi="Calibri"/>
+        </w:rPr>
+        <w:t xml:space="preserve">Firing critical/warning count, nodes ready, Kyverno violations (24h)</w:t>
+      </w:r>
+    </w:p>
+    <w:p>
+      <w:pPr>
+        <w:pStyle w:val="ListParagraph"/>
+        <w:numPr>
+          <w:ilvl w:val="0"/>
+          <w:numId w:val="43"/>
+        </w:numPr>
+        <w:spacing w:before="20" w:after="40"/>
+      </w:pPr>
+      <w:r>
+        <w:rPr>
+          <w:rFonts w:ascii="Calibri" w:cs="Calibri" w:eastAsia="Calibri" w:hAnsi="Calibri"/>
+        </w:rPr>
+        <w:t xml:space="preserve">Argo CD apps table (health + sync, colored), rollout phase timeline (canary kab abort hua)</w:t>
+      </w:r>
+    </w:p>
+    <w:p>
+      <w:pPr>
+        <w:pStyle w:val="ListParagraph"/>
+        <w:numPr>
+          <w:ilvl w:val="0"/>
+          <w:numId w:val="43"/>
         </w:numPr>
         <w:spacing w:before="20" w:after="40"/>
       </w:pPr>
@@ -40311,7 +41135,7 @@
         <w:pStyle w:val="ListParagraph"/>
         <w:numPr>
           <w:ilvl w:val="0"/>
-          <w:numId w:val="43"/>
+          <w:numId w:val="44"/>
         </w:numPr>
         <w:spacing w:before="20" w:after="40"/>
       </w:pPr>
@@ -40341,7 +41165,7 @@
         <w:pStyle w:val="ListParagraph"/>
         <w:numPr>
           <w:ilvl w:val="0"/>
-          <w:numId w:val="43"/>
+          <w:numId w:val="44"/>
         </w:numPr>
         <w:spacing w:before="20" w:after="40"/>
       </w:pPr>
@@ -40405,7 +41229,7 @@
         <w:pStyle w:val="ListParagraph"/>
         <w:numPr>
           <w:ilvl w:val="0"/>
-          <w:numId w:val="43"/>
+          <w:numId w:val="44"/>
         </w:numPr>
         <w:spacing w:before="20" w:after="40"/>
       </w:pPr>
@@ -40866,7 +41690,7 @@
         <w:pStyle w:val="ListParagraph"/>
         <w:numPr>
           <w:ilvl w:val="0"/>
-          <w:numId w:val="44"/>
+          <w:numId w:val="45"/>
         </w:numPr>
         <w:spacing w:before="20" w:after="40"/>
       </w:pPr>
@@ -41333,7 +42157,7 @@
         <w:pStyle w:val="ListParagraph"/>
         <w:numPr>
           <w:ilvl w:val="0"/>
-          <w:numId w:val="45"/>
+          <w:numId w:val="46"/>
         </w:numPr>
         <w:spacing w:before="20" w:after="40"/>
       </w:pPr>
@@ -41367,7 +42191,7 @@
         <w:pStyle w:val="ListParagraph"/>
         <w:numPr>
           <w:ilvl w:val="0"/>
-          <w:numId w:val="45"/>
+          <w:numId w:val="46"/>
         </w:numPr>
         <w:spacing w:before="20" w:after="40"/>
       </w:pPr>
@@ -41401,7 +42225,7 @@
         <w:pStyle w:val="ListParagraph"/>
         <w:numPr>
           <w:ilvl w:val="0"/>
-          <w:numId w:val="45"/>
+          <w:numId w:val="46"/>
         </w:numPr>
         <w:spacing w:before="20" w:after="40"/>
       </w:pPr>
@@ -42149,7 +42973,7 @@
         <w:pStyle w:val="ListParagraph"/>
         <w:numPr>
           <w:ilvl w:val="0"/>
-          <w:numId w:val="46"/>
+          <w:numId w:val="47"/>
         </w:numPr>
         <w:spacing w:before="20" w:after="40"/>
       </w:pPr>
@@ -42189,7 +43013,7 @@
         <w:pStyle w:val="ListParagraph"/>
         <w:numPr>
           <w:ilvl w:val="0"/>
-          <w:numId w:val="46"/>
+          <w:numId w:val="47"/>
         </w:numPr>
         <w:spacing w:before="20" w:after="40"/>
       </w:pPr>
@@ -42255,7 +43079,7 @@
         <w:pStyle w:val="ListParagraph"/>
         <w:numPr>
           <w:ilvl w:val="0"/>
-          <w:numId w:val="46"/>
+          <w:numId w:val="47"/>
         </w:numPr>
         <w:spacing w:before="20" w:after="40"/>
       </w:pPr>
@@ -42327,7 +43151,7 @@
         <w:pStyle w:val="ListParagraph"/>
         <w:numPr>
           <w:ilvl w:val="0"/>
-          <w:numId w:val="46"/>
+          <w:numId w:val="47"/>
         </w:numPr>
         <w:spacing w:before="20" w:after="40"/>
       </w:pPr>
@@ -42407,7 +43231,7 @@
         <w:pStyle w:val="ListParagraph"/>
         <w:numPr>
           <w:ilvl w:val="0"/>
-          <w:numId w:val="46"/>
+          <w:numId w:val="47"/>
         </w:numPr>
         <w:spacing w:before="20" w:after="40"/>
       </w:pPr>
@@ -42466,7 +43290,7 @@
         <w:pStyle w:val="ListParagraph"/>
         <w:numPr>
           <w:ilvl w:val="0"/>
-          <w:numId w:val="47"/>
+          <w:numId w:val="48"/>
         </w:numPr>
         <w:spacing w:before="20" w:after="40"/>
       </w:pPr>
@@ -42506,7 +43330,7 @@
         <w:pStyle w:val="ListParagraph"/>
         <w:numPr>
           <w:ilvl w:val="0"/>
-          <w:numId w:val="47"/>
+          <w:numId w:val="48"/>
         </w:numPr>
         <w:spacing w:before="20" w:after="40"/>
       </w:pPr>
@@ -42550,7 +43374,7 @@
         <w:pStyle w:val="ListParagraph"/>
         <w:numPr>
           <w:ilvl w:val="0"/>
-          <w:numId w:val="47"/>
+          <w:numId w:val="48"/>
         </w:numPr>
         <w:spacing w:before="20" w:after="40"/>
       </w:pPr>
@@ -42632,7 +43456,7 @@
         <w:pStyle w:val="ListParagraph"/>
         <w:numPr>
           <w:ilvl w:val="0"/>
-          <w:numId w:val="47"/>
+          <w:numId w:val="48"/>
         </w:numPr>
         <w:spacing w:before="20" w:after="40"/>
       </w:pPr>
@@ -42680,7 +43504,7 @@
         <w:pStyle w:val="ListParagraph"/>
         <w:numPr>
           <w:ilvl w:val="0"/>
-          <w:numId w:val="47"/>
+          <w:numId w:val="48"/>
         </w:numPr>
         <w:spacing w:before="20" w:after="40"/>
       </w:pPr>
@@ -43755,7 +44579,7 @@
         <w:pStyle w:val="ListParagraph"/>
         <w:numPr>
           <w:ilvl w:val="0"/>
-          <w:numId w:val="48"/>
+          <w:numId w:val="49"/>
         </w:numPr>
         <w:spacing w:before="20" w:after="40"/>
       </w:pPr>
@@ -43764,243 +44588,6 @@
           <w:rFonts w:ascii="Calibri" w:cs="Calibri" w:eastAsia="Calibri" w:hAnsi="Calibri"/>
         </w:rPr>
         <w:t xml:space="preserve">✅ IMDSv2 required, hop limit 1 (pods instance credentials nahi chura sakte)</w:t>
-      </w:r>
-    </w:p>
-    <w:p>
-      <w:pPr>
-        <w:pStyle w:val="ListParagraph"/>
-        <w:numPr>
-          <w:ilvl w:val="0"/>
-          <w:numId w:val="48"/>
-        </w:numPr>
-        <w:spacing w:before="20" w:after="40"/>
-      </w:pPr>
-      <w:r>
-        <w:rPr>
-          <w:rFonts w:ascii="Calibri" w:cs="Calibri" w:eastAsia="Calibri" w:hAnsi="Calibri"/>
-        </w:rPr>
-        <w:t xml:space="preserve">✅ EBS root volumes encrypted</w:t>
-      </w:r>
-    </w:p>
-    <w:p>
-      <w:pPr>
-        <w:pStyle w:val="ListParagraph"/>
-        <w:numPr>
-          <w:ilvl w:val="0"/>
-          <w:numId w:val="48"/>
-        </w:numPr>
-        <w:spacing w:before="20" w:after="40"/>
-      </w:pPr>
-      <w:r>
-        <w:rPr>
-          <w:rFonts w:ascii="Calibri" w:cs="Calibri" w:eastAsia="Calibri" w:hAnsi="Calibri"/>
-        </w:rPr>
-        <w:t xml:space="preserve">✅ SSH / 6443 / NodePorts sirf admin IP se, Jenkins se sirf NodePorts</w:t>
-      </w:r>
-    </w:p>
-    <w:p>
-      <w:pPr>
-        <w:pStyle w:val="ListParagraph"/>
-        <w:numPr>
-          <w:ilvl w:val="0"/>
-          <w:numId w:val="48"/>
-        </w:numPr>
-        <w:spacing w:before="20" w:after="40"/>
-      </w:pPr>
-      <w:r>
-        <w:rPr>
-          <w:rFonts w:ascii="Calibri" w:cs="Calibri" w:eastAsia="Calibri" w:hAnsi="Calibri"/>
-        </w:rPr>
-        <w:t xml:space="preserve">✅ Default SG locked (koi rule nahi)</w:t>
-      </w:r>
-    </w:p>
-    <w:p>
-      <w:pPr>
-        <w:pStyle w:val="ListParagraph"/>
-        <w:numPr>
-          <w:ilvl w:val="0"/>
-          <w:numId w:val="48"/>
-        </w:numPr>
-        <w:spacing w:before="20" w:after="40"/>
-      </w:pPr>
-      <w:r>
-        <w:rPr>
-          <w:rFonts w:ascii="Calibri" w:cs="Calibri" w:eastAsia="Calibri" w:hAnsi="Calibri"/>
-        </w:rPr>
-        <w:t xml:space="preserve">✅ Jenkins ke paas IAM role (static keys nahi)</w:t>
-      </w:r>
-    </w:p>
-    <w:p>
-      <w:pPr>
-        <w:pStyle w:val="ListParagraph"/>
-        <w:numPr>
-          <w:ilvl w:val="0"/>
-          <w:numId w:val="48"/>
-        </w:numPr>
-        <w:spacing w:before="20" w:after="40"/>
-      </w:pPr>
-      <w:r>
-        <w:rPr>
-          <w:rFonts w:ascii="Calibri" w:cs="Calibri" w:eastAsia="Calibri" w:hAnsi="Calibri"/>
-        </w:rPr>
-        <w:t xml:space="preserve">✅ Terraform state: S3 private, encrypted, versioned, locked</w:t>
-      </w:r>
-    </w:p>
-    <w:p>
-      <w:pPr>
-        <w:pStyle w:val="ListParagraph"/>
-        <w:numPr>
-          <w:ilvl w:val="0"/>
-          <w:numId w:val="48"/>
-        </w:numPr>
-        <w:spacing w:before="20" w:after="40"/>
-      </w:pPr>
-      <w:r>
-        <w:rPr>
-          <w:rFonts w:ascii="Calibri" w:cs="Calibri" w:eastAsia="Calibri" w:hAnsi="Calibri"/>
-        </w:rPr>
-        <w:t xml:space="preserve">✅ Out-of-band monitoring: CloudWatch alarms + SNS (cluster gir jaye tab bhi alert)</w:t>
-      </w:r>
-    </w:p>
-    <w:p>
-      <w:pPr>
-        <w:pStyle w:val="ListParagraph"/>
-        <w:numPr>
-          <w:ilvl w:val="0"/>
-          <w:numId w:val="48"/>
-        </w:numPr>
-        <w:spacing w:before="20" w:after="40"/>
-      </w:pPr>
-      <w:r>
-        <w:rPr>
-          <w:rFonts w:ascii="Calibri" w:cs="Calibri" w:eastAsia="Calibri" w:hAnsi="Calibri"/>
-        </w:rPr>
-        <w:t xml:space="preserve">✅ Kubernetes audit log + syslog CloudWatch Logs mein (off-host, tamper-resistant), 14 din retention</w:t>
-      </w:r>
-    </w:p>
-    <w:p>
-      <w:pPr>
-        <w:pStyle w:val="ListParagraph"/>
-        <w:numPr>
-          <w:ilvl w:val="0"/>
-          <w:numId w:val="48"/>
-        </w:numPr>
-        <w:spacing w:before="20" w:after="40"/>
-      </w:pPr>
-      <w:r>
-        <w:rPr>
-          <w:rFonts w:ascii="Calibri" w:cs="Calibri" w:eastAsia="Calibri" w:hAnsi="Calibri"/>
-        </w:rPr>
-        <w:t xml:space="preserve">✅ Jenkins ke IAM permissions </w:t>
-      </w:r>
-      <w:r>
-        <w:rPr>
-          <w:color w:val="B0306A"/>
-          <w:sz w:val="19"/>
-          <w:szCs w:val="19"/>
-          <w:rFonts w:ascii="Consolas" w:cs="Consolas" w:eastAsia="Consolas" w:hAnsi="Consolas"/>
-          <w:shd w:fill="EEF1F5" w:color="auto" w:val="clear"/>
-        </w:rPr>
-        <w:t xml:space="preserve">order-platform-*</w:t>
-      </w:r>
-      <w:r>
-        <w:rPr>
-          <w:rFonts w:ascii="Calibri" w:cs="Calibri" w:eastAsia="Calibri" w:hAnsi="Calibri"/>
-        </w:rPr>
-        <w:t xml:space="preserve"> naam wale IAM roles/profiles tak limited</w:t>
-      </w:r>
-    </w:p>
-    <w:p>
-      <w:pPr>
-        <w:pStyle w:val="ListParagraph"/>
-        <w:numPr>
-          <w:ilvl w:val="0"/>
-          <w:numId w:val="48"/>
-        </w:numPr>
-        <w:spacing w:before="20" w:after="40"/>
-      </w:pPr>
-      <w:r>
-        <w:rPr>
-          <w:rFonts w:ascii="Calibri" w:cs="Calibri" w:eastAsia="Calibri" w:hAnsi="Calibri"/>
-        </w:rPr>
-        <w:t xml:space="preserve">⬜ Nodes private subnets mein + NAT gateway + bastion / SSM Session Manager (SSH band)</w:t>
-      </w:r>
-    </w:p>
-    <w:p>
-      <w:pPr>
-        <w:pStyle w:val="ListParagraph"/>
-        <w:numPr>
-          <w:ilvl w:val="0"/>
-          <w:numId w:val="48"/>
-        </w:numPr>
-        <w:spacing w:before="20" w:after="40"/>
-      </w:pPr>
-      <w:r>
-        <w:rPr>
-          <w:rFonts w:ascii="Calibri" w:cs="Calibri" w:eastAsia="Calibri" w:hAnsi="Calibri"/>
-        </w:rPr>
-        <w:t xml:space="preserve">⬜ VPC Flow Logs, CloudTrail, GuardDuty (GuardDuty findings → same SNS topic)</w:t>
-      </w:r>
-    </w:p>
-    <w:p>
-      <w:pPr>
-        <w:pStyle w:val="ListParagraph"/>
-        <w:numPr>
-          <w:ilvl w:val="0"/>
-          <w:numId w:val="48"/>
-        </w:numPr>
-        <w:spacing w:before="20" w:after="40"/>
-      </w:pPr>
-      <w:r>
-        <w:rPr>
-          <w:rFonts w:ascii="Calibri" w:cs="Calibri" w:eastAsia="Calibri" w:hAnsi="Calibri"/>
-        </w:rPr>
-        <w:t xml:space="preserve">⬜ Jenkins ke IAM role ko aur least-privilege (abhi </w:t>
-      </w:r>
-      <w:r>
-        <w:rPr>
-          <w:color w:val="B0306A"/>
-          <w:sz w:val="19"/>
-          <w:szCs w:val="19"/>
-          <w:rFonts w:ascii="Consolas" w:cs="Consolas" w:eastAsia="Consolas" w:hAnsi="Consolas"/>
-          <w:shd w:fill="EEF1F5" w:color="auto" w:val="clear"/>
-        </w:rPr>
-        <w:t xml:space="preserve">AmazonEC2FullAccess</w:t>
-      </w:r>
-      <w:r>
-        <w:rPr>
-          <w:rFonts w:ascii="Calibri" w:cs="Calibri" w:eastAsia="Calibri" w:hAnsi="Calibri"/>
-        </w:rPr>
-        <w:t xml:space="preserve"> hai)</w:t>
-      </w:r>
-    </w:p>
-    <w:p>
-      <w:pPr>
-        <w:pStyle w:val="ListParagraph"/>
-        <w:numPr>
-          <w:ilvl w:val="0"/>
-          <w:numId w:val="48"/>
-        </w:numPr>
-        <w:spacing w:before="20" w:after="40"/>
-      </w:pPr>
-      <w:r>
-        <w:rPr>
-          <w:rFonts w:ascii="Calibri" w:cs="Calibri" w:eastAsia="Calibri" w:hAnsi="Calibri"/>
-        </w:rPr>
-        <w:t xml:space="preserve">⬜ CloudWatch log groups KMS key se encrypt</w:t>
-      </w:r>
-    </w:p>
-    <w:p>
-      <w:pPr>
-        <w:spacing w:after="120"/>
-      </w:pPr>
-      <w:r>
-        <w:rPr>
-          <w:b/>
-          <w:bCs/>
-          <w:rFonts w:ascii="Calibri" w:cs="Calibri" w:eastAsia="Calibri" w:hAnsi="Calibri"/>
-        </w:rPr>
-        <w:t xml:space="preserve">Kubernetes</w:t>
       </w:r>
     </w:p>
     <w:p>
@@ -44016,23 +44603,7 @@
         <w:rPr>
           <w:rFonts w:ascii="Calibri" w:cs="Calibri" w:eastAsia="Calibri" w:hAnsi="Calibri"/>
         </w:rPr>
-        <w:t xml:space="preserve">✅ kubeadm CA pre-generated, workers CA hash pin karte hain (no </w:t>
-      </w:r>
-      <w:r>
-        <w:rPr>
-          <w:color w:val="B0306A"/>
-          <w:sz w:val="19"/>
-          <w:szCs w:val="19"/>
-          <w:rFonts w:ascii="Consolas" w:cs="Consolas" w:eastAsia="Consolas" w:hAnsi="Consolas"/>
-          <w:shd w:fill="EEF1F5" w:color="auto" w:val="clear"/>
-        </w:rPr>
-        <w:t xml:space="preserve">--discovery-token-unsafe-skip-ca-verification</w:t>
-      </w:r>
-      <w:r>
-        <w:rPr>
-          <w:rFonts w:ascii="Calibri" w:cs="Calibri" w:eastAsia="Calibri" w:hAnsi="Calibri"/>
-        </w:rPr>
-        <w:t xml:space="preserve">)</w:t>
+        <w:t xml:space="preserve">✅ EBS root volumes encrypted</w:t>
       </w:r>
     </w:p>
     <w:p>
@@ -44048,7 +44619,7 @@
         <w:rPr>
           <w:rFonts w:ascii="Calibri" w:cs="Calibri" w:eastAsia="Calibri" w:hAnsi="Calibri"/>
         </w:rPr>
-        <w:t xml:space="preserve">✅ API server audit logging, profiling disabled, kubelet read-only port 0</w:t>
+        <w:t xml:space="preserve">✅ SSH / 6443 / NodePorts sirf admin IP se, Jenkins se sirf NodePorts</w:t>
       </w:r>
     </w:p>
     <w:p>
@@ -44064,23 +44635,7 @@
         <w:rPr>
           <w:rFonts w:ascii="Calibri" w:cs="Calibri" w:eastAsia="Calibri" w:hAnsi="Calibri"/>
         </w:rPr>
-        <w:t xml:space="preserve">✅ Pod Security Admission </w:t>
-      </w:r>
-      <w:r>
-        <w:rPr>
-          <w:color w:val="B0306A"/>
-          <w:sz w:val="19"/>
-          <w:szCs w:val="19"/>
-          <w:rFonts w:ascii="Consolas" w:cs="Consolas" w:eastAsia="Consolas" w:hAnsi="Consolas"/>
-          <w:shd w:fill="EEF1F5" w:color="auto" w:val="clear"/>
-        </w:rPr>
-        <w:t xml:space="preserve">restricted</w:t>
-      </w:r>
-      <w:r>
-        <w:rPr>
-          <w:rFonts w:ascii="Calibri" w:cs="Calibri" w:eastAsia="Calibri" w:hAnsi="Calibri"/>
-        </w:rPr>
-        <w:t xml:space="preserve"> on app namespace</w:t>
+        <w:t xml:space="preserve">✅ Default SG locked (koi rule nahi)</w:t>
       </w:r>
     </w:p>
     <w:p>
@@ -44096,7 +44651,7 @@
         <w:rPr>
           <w:rFonts w:ascii="Calibri" w:cs="Calibri" w:eastAsia="Calibri" w:hAnsi="Calibri"/>
         </w:rPr>
-        <w:t xml:space="preserve">✅ Kyverno policies (Enforce in staging/prod)</w:t>
+        <w:t xml:space="preserve">✅ Jenkins ke paas IAM role (static keys nahi)</w:t>
       </w:r>
     </w:p>
     <w:p>
@@ -44112,7 +44667,7 @@
         <w:rPr>
           <w:rFonts w:ascii="Calibri" w:cs="Calibri" w:eastAsia="Calibri" w:hAnsi="Calibri"/>
         </w:rPr>
-        <w:t xml:space="preserve">✅ Default-deny NetworkPolicies (Calico)</w:t>
+        <w:t xml:space="preserve">✅ Terraform state: S3 private, encrypted, versioned, locked</w:t>
       </w:r>
     </w:p>
     <w:p>
@@ -44128,7 +44683,7 @@
         <w:rPr>
           <w:rFonts w:ascii="Calibri" w:cs="Calibri" w:eastAsia="Calibri" w:hAnsi="Calibri"/>
         </w:rPr>
-        <w:t xml:space="preserve">✅ Containers: non-root UID 10001, read-only root FS, drop ALL caps, seccomp RuntimeDefault, no SA token</w:t>
+        <w:t xml:space="preserve">✅ Out-of-band monitoring: CloudWatch alarms + SNS (cluster gir jaye tab bhi alert)</w:t>
       </w:r>
     </w:p>
     <w:p>
@@ -44144,7 +44699,7 @@
         <w:rPr>
           <w:rFonts w:ascii="Calibri" w:cs="Calibri" w:eastAsia="Calibri" w:hAnsi="Calibri"/>
         </w:rPr>
-        <w:t xml:space="preserve">✅ Argo CD AppProject: order-service sirf apne namespace mein deploy ho sakta hai</w:t>
+        <w:t xml:space="preserve">✅ Kubernetes audit log + syslog CloudWatch Logs mein (off-host, tamper-resistant), 14 din retention</w:t>
       </w:r>
     </w:p>
     <w:p>
@@ -44160,7 +44715,7 @@
         <w:rPr>
           <w:rFonts w:ascii="Calibri" w:cs="Calibri" w:eastAsia="Calibri" w:hAnsi="Calibri"/>
         </w:rPr>
-        <w:t xml:space="preserve">✅ Grafana admin password random, secret mein (default </w:t>
+        <w:t xml:space="preserve">✅ Jenkins ke IAM permissions </w:t>
       </w:r>
       <w:r>
         <w:rPr>
@@ -44170,13 +44725,13 @@
           <w:rFonts w:ascii="Consolas" w:cs="Consolas" w:eastAsia="Consolas" w:hAnsi="Consolas"/>
           <w:shd w:fill="EEF1F5" w:color="auto" w:val="clear"/>
         </w:rPr>
-        <w:t xml:space="preserve">prom-operator</w:t>
-      </w:r>
-      <w:r>
-        <w:rPr>
-          <w:rFonts w:ascii="Calibri" w:cs="Calibri" w:eastAsia="Calibri" w:hAnsi="Calibri"/>
-        </w:rPr>
-        <w:t xml:space="preserve"> nahi); Slack webhook bhi secret mein, Git mein nahi</w:t>
+        <w:t xml:space="preserve">order-platform-*</w:t>
+      </w:r>
+      <w:r>
+        <w:rPr>
+          <w:rFonts w:ascii="Calibri" w:cs="Calibri" w:eastAsia="Calibri" w:hAnsi="Calibri"/>
+        </w:rPr>
+        <w:t xml:space="preserve"> naam wale IAM roles/profiles tak limited</w:t>
       </w:r>
     </w:p>
     <w:p>
@@ -44192,7 +44747,7 @@
         <w:rPr>
           <w:rFonts w:ascii="Calibri" w:cs="Calibri" w:eastAsia="Calibri" w:hAnsi="Calibri"/>
         </w:rPr>
-        <w:t xml:space="preserve">⬜ Grafana/Prometheus/Alertmanager ke aage auth + TLS (abhi sirf SG se protected), Grafana SSO</w:t>
+        <w:t xml:space="preserve">⬜ Nodes private subnets mein + NAT gateway + bastion / SSM Session Manager (SSH band)</w:t>
       </w:r>
     </w:p>
     <w:p>
@@ -44208,23 +44763,7 @@
         <w:rPr>
           <w:rFonts w:ascii="Calibri" w:cs="Calibri" w:eastAsia="Calibri" w:hAnsi="Calibri"/>
         </w:rPr>
-        <w:t xml:space="preserve">⬜ Prometheus ke liye persistent storage (abhi </w:t>
-      </w:r>
-      <w:r>
-        <w:rPr>
-          <w:color w:val="B0306A"/>
-          <w:sz w:val="19"/>
-          <w:szCs w:val="19"/>
-          <w:rFonts w:ascii="Consolas" w:cs="Consolas" w:eastAsia="Consolas" w:hAnsi="Consolas"/>
-          <w:shd w:fill="EEF1F5" w:color="auto" w:val="clear"/>
-        </w:rPr>
-        <w:t xml:space="preserve">emptyDir</w:t>
-      </w:r>
-      <w:r>
-        <w:rPr>
-          <w:rFonts w:ascii="Calibri" w:cs="Calibri" w:eastAsia="Calibri" w:hAnsi="Calibri"/>
-        </w:rPr>
-        <w:t xml:space="preserve">, restart pe data jaata hai)</w:t>
+        <w:t xml:space="preserve">⬜ VPC Flow Logs, CloudTrail, GuardDuty (GuardDuty findings → same SNS topic)</w:t>
       </w:r>
     </w:p>
     <w:p>
@@ -44240,7 +44779,7 @@
         <w:rPr>
           <w:rFonts w:ascii="Calibri" w:cs="Calibri" w:eastAsia="Calibri" w:hAnsi="Calibri"/>
         </w:rPr>
-        <w:t xml:space="preserve">⬜ etcd encryption at rest for Secrets (</w:t>
+        <w:t xml:space="preserve">⬜ Jenkins ke IAM role ko aur least-privilege (abhi </w:t>
       </w:r>
       <w:r>
         <w:rPr>
@@ -44250,13 +44789,13 @@
           <w:rFonts w:ascii="Consolas" w:cs="Consolas" w:eastAsia="Consolas" w:hAnsi="Consolas"/>
           <w:shd w:fill="EEF1F5" w:color="auto" w:val="clear"/>
         </w:rPr>
-        <w:t xml:space="preserve">EncryptionConfiguration</w:t>
-      </w:r>
-      <w:r>
-        <w:rPr>
-          <w:rFonts w:ascii="Calibri" w:cs="Calibri" w:eastAsia="Calibri" w:hAnsi="Calibri"/>
-        </w:rPr>
-        <w:t xml:space="preserve">)</w:t>
+        <w:t xml:space="preserve">AmazonEC2FullAccess</w:t>
+      </w:r>
+      <w:r>
+        <w:rPr>
+          <w:rFonts w:ascii="Calibri" w:cs="Calibri" w:eastAsia="Calibri" w:hAnsi="Calibri"/>
+        </w:rPr>
+        <w:t xml:space="preserve"> hai)</w:t>
       </w:r>
     </w:p>
     <w:p>
@@ -44272,75 +44811,7 @@
         <w:rPr>
           <w:rFonts w:ascii="Calibri" w:cs="Calibri" w:eastAsia="Calibri" w:hAnsi="Calibri"/>
         </w:rPr>
-        <w:t xml:space="preserve">⬜ kube-bench (CIS benchmark) run: </w:t>
-      </w:r>
-      <w:r>
-        <w:rPr>
-          <w:color w:val="B0306A"/>
-          <w:sz w:val="19"/>
-          <w:szCs w:val="19"/>
-          <w:rFonts w:ascii="Consolas" w:cs="Consolas" w:eastAsia="Consolas" w:hAnsi="Consolas"/>
-          <w:shd w:fill="EEF1F5" w:color="auto" w:val="clear"/>
-        </w:rPr>
-        <w:t xml:space="preserve">kubectl apply -f https://raw.githubusercontent.com/aquasecurity/kube-bench/main/job.yaml</w:t>
-      </w:r>
-    </w:p>
-    <w:p>
-      <w:pPr>
-        <w:pStyle w:val="ListParagraph"/>
-        <w:numPr>
-          <w:ilvl w:val="0"/>
-          <w:numId w:val="49"/>
-        </w:numPr>
-        <w:spacing w:before="20" w:after="40"/>
-      </w:pPr>
-      <w:r>
-        <w:rPr>
-          <w:rFonts w:ascii="Calibri" w:cs="Calibri" w:eastAsia="Calibri" w:hAnsi="Calibri"/>
-        </w:rPr>
-        <w:t xml:space="preserve">⬜ Ingress + TLS (cert-manager) instead of NodePorts</w:t>
-      </w:r>
-    </w:p>
-    <w:p>
-      <w:pPr>
-        <w:pStyle w:val="ListParagraph"/>
-        <w:numPr>
-          <w:ilvl w:val="0"/>
-          <w:numId w:val="49"/>
-        </w:numPr>
-        <w:spacing w:before="20" w:after="40"/>
-      </w:pPr>
-      <w:r>
-        <w:rPr>
-          <w:rFonts w:ascii="Calibri" w:cs="Calibri" w:eastAsia="Calibri" w:hAnsi="Calibri"/>
-        </w:rPr>
-        <w:t xml:space="preserve">⬜ Image signing (cosign) + Kyverno </w:t>
-      </w:r>
-      <w:r>
-        <w:rPr>
-          <w:color w:val="B0306A"/>
-          <w:sz w:val="19"/>
-          <w:szCs w:val="19"/>
-          <w:rFonts w:ascii="Consolas" w:cs="Consolas" w:eastAsia="Consolas" w:hAnsi="Consolas"/>
-          <w:shd w:fill="EEF1F5" w:color="auto" w:val="clear"/>
-        </w:rPr>
-        <w:t xml:space="preserve">verifyImages</w:t>
-      </w:r>
-    </w:p>
-    <w:p>
-      <w:pPr>
-        <w:pStyle w:val="ListParagraph"/>
-        <w:numPr>
-          <w:ilvl w:val="0"/>
-          <w:numId w:val="49"/>
-        </w:numPr>
-        <w:spacing w:before="20" w:after="40"/>
-      </w:pPr>
-      <w:r>
-        <w:rPr>
-          <w:rFonts w:ascii="Calibri" w:cs="Calibri" w:eastAsia="Calibri" w:hAnsi="Calibri"/>
-        </w:rPr>
-        <w:t xml:space="preserve">⬜ Argo CD SSO + RBAC, admin user disable</w:t>
+        <w:t xml:space="preserve">⬜ CloudWatch log groups KMS key se encrypt</w:t>
       </w:r>
     </w:p>
     <w:p>
@@ -44353,7 +44824,7 @@
           <w:bCs/>
           <w:rFonts w:ascii="Calibri" w:cs="Calibri" w:eastAsia="Calibri" w:hAnsi="Calibri"/>
         </w:rPr>
-        <w:t xml:space="preserve">CI/CD</w:t>
+        <w:t xml:space="preserve">Kubernetes</w:t>
       </w:r>
     </w:p>
     <w:p>
@@ -44369,7 +44840,23 @@
         <w:rPr>
           <w:rFonts w:ascii="Calibri" w:cs="Calibri" w:eastAsia="Calibri" w:hAnsi="Calibri"/>
         </w:rPr>
-        <w:t xml:space="preserve">✅ Immutable image tags, build once promote many</w:t>
+        <w:t xml:space="preserve">✅ kubeadm CA pre-generated, workers CA hash pin karte hain (no </w:t>
+      </w:r>
+      <w:r>
+        <w:rPr>
+          <w:color w:val="B0306A"/>
+          <w:sz w:val="19"/>
+          <w:szCs w:val="19"/>
+          <w:rFonts w:ascii="Consolas" w:cs="Consolas" w:eastAsia="Consolas" w:hAnsi="Consolas"/>
+          <w:shd w:fill="EEF1F5" w:color="auto" w:val="clear"/>
+        </w:rPr>
+        <w:t xml:space="preserve">--discovery-token-unsafe-skip-ca-verification</w:t>
+      </w:r>
+      <w:r>
+        <w:rPr>
+          <w:rFonts w:ascii="Calibri" w:cs="Calibri" w:eastAsia="Calibri" w:hAnsi="Calibri"/>
+        </w:rPr>
+        <w:t xml:space="preserve">)</w:t>
       </w:r>
     </w:p>
     <w:p>
@@ -44385,7 +44872,7 @@
         <w:rPr>
           <w:rFonts w:ascii="Calibri" w:cs="Calibri" w:eastAsia="Calibri" w:hAnsi="Calibri"/>
         </w:rPr>
-        <w:t xml:space="preserve">✅ Trivy gate, conftest gates, approval gates</w:t>
+        <w:t xml:space="preserve">✅ API server audit logging, profiling disabled, kubelet read-only port 0</w:t>
       </w:r>
     </w:p>
     <w:p>
@@ -44401,7 +44888,23 @@
         <w:rPr>
           <w:rFonts w:ascii="Calibri" w:cs="Calibri" w:eastAsia="Calibri" w:hAnsi="Calibri"/>
         </w:rPr>
-        <w:t xml:space="preserve">✅ Secrets Jenkins credentials store mein, logs mein masked</w:t>
+        <w:t xml:space="preserve">✅ Pod Security Admission </w:t>
+      </w:r>
+      <w:r>
+        <w:rPr>
+          <w:color w:val="B0306A"/>
+          <w:sz w:val="19"/>
+          <w:szCs w:val="19"/>
+          <w:rFonts w:ascii="Consolas" w:cs="Consolas" w:eastAsia="Consolas" w:hAnsi="Consolas"/>
+          <w:shd w:fill="EEF1F5" w:color="auto" w:val="clear"/>
+        </w:rPr>
+        <w:t xml:space="preserve">restricted</w:t>
+      </w:r>
+      <w:r>
+        <w:rPr>
+          <w:rFonts w:ascii="Calibri" w:cs="Calibri" w:eastAsia="Calibri" w:hAnsi="Calibri"/>
+        </w:rPr>
+        <w:t xml:space="preserve"> on app namespace</w:t>
       </w:r>
     </w:p>
     <w:p>
@@ -44417,7 +44920,7 @@
         <w:rPr>
           <w:rFonts w:ascii="Calibri" w:cs="Calibri" w:eastAsia="Calibri" w:hAnsi="Calibri"/>
         </w:rPr>
-        <w:t xml:space="preserve">⬜ Jenkins agents (controller pe builds nahi), HTTPS for Jenkins (Nginx + Let's Encrypt)</w:t>
+        <w:t xml:space="preserve">✅ Kyverno policies (Enforce in staging/prod)</w:t>
       </w:r>
     </w:p>
     <w:p>
@@ -44433,7 +44936,55 @@
         <w:rPr>
           <w:rFonts w:ascii="Calibri" w:cs="Calibri" w:eastAsia="Calibri" w:hAnsi="Calibri"/>
         </w:rPr>
-        <w:t xml:space="preserve">⬜ SBOM (</w:t>
+        <w:t xml:space="preserve">✅ Default-deny NetworkPolicies (Calico)</w:t>
+      </w:r>
+    </w:p>
+    <w:p>
+      <w:pPr>
+        <w:pStyle w:val="ListParagraph"/>
+        <w:numPr>
+          <w:ilvl w:val="0"/>
+          <w:numId w:val="50"/>
+        </w:numPr>
+        <w:spacing w:before="20" w:after="40"/>
+      </w:pPr>
+      <w:r>
+        <w:rPr>
+          <w:rFonts w:ascii="Calibri" w:cs="Calibri" w:eastAsia="Calibri" w:hAnsi="Calibri"/>
+        </w:rPr>
+        <w:t xml:space="preserve">✅ Containers: non-root UID 10001, read-only root FS, drop ALL caps, seccomp RuntimeDefault, no SA token</w:t>
+      </w:r>
+    </w:p>
+    <w:p>
+      <w:pPr>
+        <w:pStyle w:val="ListParagraph"/>
+        <w:numPr>
+          <w:ilvl w:val="0"/>
+          <w:numId w:val="50"/>
+        </w:numPr>
+        <w:spacing w:before="20" w:after="40"/>
+      </w:pPr>
+      <w:r>
+        <w:rPr>
+          <w:rFonts w:ascii="Calibri" w:cs="Calibri" w:eastAsia="Calibri" w:hAnsi="Calibri"/>
+        </w:rPr>
+        <w:t xml:space="preserve">✅ Argo CD AppProject: order-service sirf apne namespace mein deploy ho sakta hai</w:t>
+      </w:r>
+    </w:p>
+    <w:p>
+      <w:pPr>
+        <w:pStyle w:val="ListParagraph"/>
+        <w:numPr>
+          <w:ilvl w:val="0"/>
+          <w:numId w:val="50"/>
+        </w:numPr>
+        <w:spacing w:before="20" w:after="40"/>
+      </w:pPr>
+      <w:r>
+        <w:rPr>
+          <w:rFonts w:ascii="Calibri" w:cs="Calibri" w:eastAsia="Calibri" w:hAnsi="Calibri"/>
+        </w:rPr>
+        <w:t xml:space="preserve">✅ Grafana admin password random, secret mein (default </w:t>
       </w:r>
       <w:r>
         <w:rPr>
@@ -44443,44 +44994,177 @@
           <w:rFonts w:ascii="Consolas" w:cs="Consolas" w:eastAsia="Consolas" w:hAnsi="Consolas"/>
           <w:shd w:fill="EEF1F5" w:color="auto" w:val="clear"/>
         </w:rPr>
-        <w:t xml:space="preserve">trivy image --format cyclonedx</w:t>
-      </w:r>
-      <w:r>
-        <w:rPr>
-          <w:rFonts w:ascii="Calibri" w:cs="Calibri" w:eastAsia="Calibri" w:hAnsi="Calibri"/>
-        </w:rPr>
-        <w:t xml:space="preserve">), SonarQube</w:t>
-      </w:r>
-    </w:p>
-    <w:p>
-      <w:pPr>
-        <w:pBdr>
-          <w:bottom w:val="single" w:color="BFC8D2" w:sz="6" w:space="1"/>
-        </w:pBdr>
-        <w:spacing w:before="120" w:after="200"/>
-      </w:pPr>
-    </w:p>
-    <w:p>
-      <w:pPr>
-        <w:pStyle w:val="Heading2"/>
-        <w:keepNext/>
-      </w:pPr>
-      <w:r>
-        <w:rPr>
-          <w:rFonts w:ascii="Calibri" w:cs="Calibri" w:eastAsia="Calibri" w:hAnsi="Calibri"/>
-        </w:rPr>
-        <w:t xml:space="preserve">I. Infra changes promote karna</w:t>
-      </w:r>
-    </w:p>
-    <w:p>
-      <w:pPr>
-        <w:spacing w:after="120"/>
-      </w:pPr>
-      <w:r>
-        <w:rPr>
-          <w:rFonts w:ascii="Calibri" w:cs="Calibri" w:eastAsia="Calibri" w:hAnsi="Calibri"/>
-        </w:rPr>
-        <w:t xml:space="preserve">Do tarah ka "infra" hai, aur dono dev → staging → prod jaate hain:</w:t>
+        <w:t xml:space="preserve">prom-operator</w:t>
+      </w:r>
+      <w:r>
+        <w:rPr>
+          <w:rFonts w:ascii="Calibri" w:cs="Calibri" w:eastAsia="Calibri" w:hAnsi="Calibri"/>
+        </w:rPr>
+        <w:t xml:space="preserve"> nahi); Slack webhook bhi secret mein, Git mein nahi</w:t>
+      </w:r>
+    </w:p>
+    <w:p>
+      <w:pPr>
+        <w:pStyle w:val="ListParagraph"/>
+        <w:numPr>
+          <w:ilvl w:val="0"/>
+          <w:numId w:val="50"/>
+        </w:numPr>
+        <w:spacing w:before="20" w:after="40"/>
+      </w:pPr>
+      <w:r>
+        <w:rPr>
+          <w:rFonts w:ascii="Calibri" w:cs="Calibri" w:eastAsia="Calibri" w:hAnsi="Calibri"/>
+        </w:rPr>
+        <w:t xml:space="preserve">⬜ Grafana/Prometheus/Alertmanager ke aage auth + TLS (abhi sirf SG se protected), Grafana SSO</w:t>
+      </w:r>
+    </w:p>
+    <w:p>
+      <w:pPr>
+        <w:pStyle w:val="ListParagraph"/>
+        <w:numPr>
+          <w:ilvl w:val="0"/>
+          <w:numId w:val="50"/>
+        </w:numPr>
+        <w:spacing w:before="20" w:after="40"/>
+      </w:pPr>
+      <w:r>
+        <w:rPr>
+          <w:rFonts w:ascii="Calibri" w:cs="Calibri" w:eastAsia="Calibri" w:hAnsi="Calibri"/>
+        </w:rPr>
+        <w:t xml:space="preserve">⬜ Prometheus ke liye persistent storage (abhi </w:t>
+      </w:r>
+      <w:r>
+        <w:rPr>
+          <w:color w:val="B0306A"/>
+          <w:sz w:val="19"/>
+          <w:szCs w:val="19"/>
+          <w:rFonts w:ascii="Consolas" w:cs="Consolas" w:eastAsia="Consolas" w:hAnsi="Consolas"/>
+          <w:shd w:fill="EEF1F5" w:color="auto" w:val="clear"/>
+        </w:rPr>
+        <w:t xml:space="preserve">emptyDir</w:t>
+      </w:r>
+      <w:r>
+        <w:rPr>
+          <w:rFonts w:ascii="Calibri" w:cs="Calibri" w:eastAsia="Calibri" w:hAnsi="Calibri"/>
+        </w:rPr>
+        <w:t xml:space="preserve">, restart pe data jaata hai)</w:t>
+      </w:r>
+    </w:p>
+    <w:p>
+      <w:pPr>
+        <w:pStyle w:val="ListParagraph"/>
+        <w:numPr>
+          <w:ilvl w:val="0"/>
+          <w:numId w:val="50"/>
+        </w:numPr>
+        <w:spacing w:before="20" w:after="40"/>
+      </w:pPr>
+      <w:r>
+        <w:rPr>
+          <w:rFonts w:ascii="Calibri" w:cs="Calibri" w:eastAsia="Calibri" w:hAnsi="Calibri"/>
+        </w:rPr>
+        <w:t xml:space="preserve">⬜ etcd encryption at rest for Secrets (</w:t>
+      </w:r>
+      <w:r>
+        <w:rPr>
+          <w:color w:val="B0306A"/>
+          <w:sz w:val="19"/>
+          <w:szCs w:val="19"/>
+          <w:rFonts w:ascii="Consolas" w:cs="Consolas" w:eastAsia="Consolas" w:hAnsi="Consolas"/>
+          <w:shd w:fill="EEF1F5" w:color="auto" w:val="clear"/>
+        </w:rPr>
+        <w:t xml:space="preserve">EncryptionConfiguration</w:t>
+      </w:r>
+      <w:r>
+        <w:rPr>
+          <w:rFonts w:ascii="Calibri" w:cs="Calibri" w:eastAsia="Calibri" w:hAnsi="Calibri"/>
+        </w:rPr>
+        <w:t xml:space="preserve">)</w:t>
+      </w:r>
+    </w:p>
+    <w:p>
+      <w:pPr>
+        <w:pStyle w:val="ListParagraph"/>
+        <w:numPr>
+          <w:ilvl w:val="0"/>
+          <w:numId w:val="50"/>
+        </w:numPr>
+        <w:spacing w:before="20" w:after="40"/>
+      </w:pPr>
+      <w:r>
+        <w:rPr>
+          <w:rFonts w:ascii="Calibri" w:cs="Calibri" w:eastAsia="Calibri" w:hAnsi="Calibri"/>
+        </w:rPr>
+        <w:t xml:space="preserve">⬜ kube-bench (CIS benchmark) run: </w:t>
+      </w:r>
+      <w:r>
+        <w:rPr>
+          <w:color w:val="B0306A"/>
+          <w:sz w:val="19"/>
+          <w:szCs w:val="19"/>
+          <w:rFonts w:ascii="Consolas" w:cs="Consolas" w:eastAsia="Consolas" w:hAnsi="Consolas"/>
+          <w:shd w:fill="EEF1F5" w:color="auto" w:val="clear"/>
+        </w:rPr>
+        <w:t xml:space="preserve">kubectl apply -f https://raw.githubusercontent.com/aquasecurity/kube-bench/main/job.yaml</w:t>
+      </w:r>
+    </w:p>
+    <w:p>
+      <w:pPr>
+        <w:pStyle w:val="ListParagraph"/>
+        <w:numPr>
+          <w:ilvl w:val="0"/>
+          <w:numId w:val="50"/>
+        </w:numPr>
+        <w:spacing w:before="20" w:after="40"/>
+      </w:pPr>
+      <w:r>
+        <w:rPr>
+          <w:rFonts w:ascii="Calibri" w:cs="Calibri" w:eastAsia="Calibri" w:hAnsi="Calibri"/>
+        </w:rPr>
+        <w:t xml:space="preserve">⬜ Ingress + TLS (cert-manager) instead of NodePorts</w:t>
+      </w:r>
+    </w:p>
+    <w:p>
+      <w:pPr>
+        <w:pStyle w:val="ListParagraph"/>
+        <w:numPr>
+          <w:ilvl w:val="0"/>
+          <w:numId w:val="50"/>
+        </w:numPr>
+        <w:spacing w:before="20" w:after="40"/>
+      </w:pPr>
+      <w:r>
+        <w:rPr>
+          <w:rFonts w:ascii="Calibri" w:cs="Calibri" w:eastAsia="Calibri" w:hAnsi="Calibri"/>
+        </w:rPr>
+        <w:t xml:space="preserve">⬜ Image signing (cosign) + Kyverno </w:t>
+      </w:r>
+      <w:r>
+        <w:rPr>
+          <w:color w:val="B0306A"/>
+          <w:sz w:val="19"/>
+          <w:szCs w:val="19"/>
+          <w:rFonts w:ascii="Consolas" w:cs="Consolas" w:eastAsia="Consolas" w:hAnsi="Consolas"/>
+          <w:shd w:fill="EEF1F5" w:color="auto" w:val="clear"/>
+        </w:rPr>
+        <w:t xml:space="preserve">verifyImages</w:t>
+      </w:r>
+    </w:p>
+    <w:p>
+      <w:pPr>
+        <w:pStyle w:val="ListParagraph"/>
+        <w:numPr>
+          <w:ilvl w:val="0"/>
+          <w:numId w:val="50"/>
+        </w:numPr>
+        <w:spacing w:before="20" w:after="40"/>
+      </w:pPr>
+      <w:r>
+        <w:rPr>
+          <w:rFonts w:ascii="Calibri" w:cs="Calibri" w:eastAsia="Calibri" w:hAnsi="Calibri"/>
+        </w:rPr>
+        <w:t xml:space="preserve">⬜ Argo CD SSO + RBAC, admin user disable</w:t>
       </w:r>
     </w:p>
     <w:p>
@@ -44493,13 +45177,7 @@
           <w:bCs/>
           <w:rFonts w:ascii="Calibri" w:cs="Calibri" w:eastAsia="Calibri" w:hAnsi="Calibri"/>
         </w:rPr>
-        <w:t xml:space="preserve">1. AWS infra (Terraform):</w:t>
-      </w:r>
-      <w:r>
-        <w:rPr>
-          <w:rFonts w:ascii="Calibri" w:cs="Calibri" w:eastAsia="Calibri" w:hAnsi="Calibri"/>
-        </w:rPr>
-        <w:t xml:space="preserve"> e.g. prod workers 3 se 4 karne hain:</w:t>
+        <w:t xml:space="preserve">CI/CD</w:t>
       </w:r>
     </w:p>
     <w:p>
@@ -44513,51 +45191,9 @@
       </w:pPr>
       <w:r>
         <w:rPr>
-          <w:color w:val="B0306A"/>
-          <w:sz w:val="19"/>
-          <w:szCs w:val="19"/>
-          <w:rFonts w:ascii="Consolas" w:cs="Consolas" w:eastAsia="Consolas" w:hAnsi="Consolas"/>
-          <w:shd w:fill="EEF1F5" w:color="auto" w:val="clear"/>
-        </w:rPr>
-        <w:t xml:space="preserve">terraform/stacks/cluster/envs/prod.tfvars</w:t>
-      </w:r>
-      <w:r>
-        <w:rPr>
-          <w:rFonts w:ascii="Calibri" w:cs="Calibri" w:eastAsia="Calibri" w:hAnsi="Calibri"/>
-        </w:rPr>
-        <w:t xml:space="preserve"> mein </w:t>
-      </w:r>
-      <w:r>
-        <w:rPr>
-          <w:color w:val="B0306A"/>
-          <w:sz w:val="19"/>
-          <w:szCs w:val="19"/>
-          <w:rFonts w:ascii="Consolas" w:cs="Consolas" w:eastAsia="Consolas" w:hAnsi="Consolas"/>
-          <w:shd w:fill="EEF1F5" w:color="auto" w:val="clear"/>
-        </w:rPr>
-        <w:t xml:space="preserve">worker_count = 4</w:t>
-      </w:r>
-      <w:r>
-        <w:rPr>
-          <w:rFonts w:ascii="Calibri" w:cs="Calibri" w:eastAsia="Calibri" w:hAnsi="Calibri"/>
-        </w:rPr>
-        <w:t xml:space="preserve"> → commit → </w:t>
-      </w:r>
-      <w:r>
-        <w:rPr>
-          <w:color w:val="B0306A"/>
-          <w:sz w:val="19"/>
-          <w:szCs w:val="19"/>
-          <w:rFonts w:ascii="Consolas" w:cs="Consolas" w:eastAsia="Consolas" w:hAnsi="Consolas"/>
-          <w:shd w:fill="EEF1F5" w:color="auto" w:val="clear"/>
-        </w:rPr>
-        <w:t xml:space="preserve">order-platform-infra</w:t>
-      </w:r>
-      <w:r>
-        <w:rPr>
-          <w:rFonts w:ascii="Calibri" w:cs="Calibri" w:eastAsia="Calibri" w:hAnsi="Calibri"/>
-        </w:rPr>
-        <w:t xml:space="preserve"> job chala.</w:t>
+          <w:rFonts w:ascii="Calibri" w:cs="Calibri" w:eastAsia="Calibri" w:hAnsi="Calibri"/>
+        </w:rPr>
+        <w:t xml:space="preserve">✅ Immutable image tags, build once promote many</w:t>
       </w:r>
     </w:p>
     <w:p>
@@ -44573,7 +45209,102 @@
         <w:rPr>
           <w:rFonts w:ascii="Calibri" w:cs="Calibri" w:eastAsia="Calibri" w:hAnsi="Calibri"/>
         </w:rPr>
-        <w:t xml:space="preserve">Module code change (sab envs ko affect karta hai)? Pipeline pehle dev apply karegi, phir staging plan + approval, phir prod plan + approval.</w:t>
+        <w:t xml:space="preserve">✅ Trivy gate, conftest gates, approval gates</w:t>
+      </w:r>
+    </w:p>
+    <w:p>
+      <w:pPr>
+        <w:pStyle w:val="ListParagraph"/>
+        <w:numPr>
+          <w:ilvl w:val="0"/>
+          <w:numId w:val="51"/>
+        </w:numPr>
+        <w:spacing w:before="20" w:after="40"/>
+      </w:pPr>
+      <w:r>
+        <w:rPr>
+          <w:rFonts w:ascii="Calibri" w:cs="Calibri" w:eastAsia="Calibri" w:hAnsi="Calibri"/>
+        </w:rPr>
+        <w:t xml:space="preserve">✅ Secrets Jenkins credentials store mein, logs mein masked</w:t>
+      </w:r>
+    </w:p>
+    <w:p>
+      <w:pPr>
+        <w:pStyle w:val="ListParagraph"/>
+        <w:numPr>
+          <w:ilvl w:val="0"/>
+          <w:numId w:val="51"/>
+        </w:numPr>
+        <w:spacing w:before="20" w:after="40"/>
+      </w:pPr>
+      <w:r>
+        <w:rPr>
+          <w:rFonts w:ascii="Calibri" w:cs="Calibri" w:eastAsia="Calibri" w:hAnsi="Calibri"/>
+        </w:rPr>
+        <w:t xml:space="preserve">⬜ Jenkins agents (controller pe builds nahi), HTTPS for Jenkins (Nginx + Let's Encrypt)</w:t>
+      </w:r>
+    </w:p>
+    <w:p>
+      <w:pPr>
+        <w:pStyle w:val="ListParagraph"/>
+        <w:numPr>
+          <w:ilvl w:val="0"/>
+          <w:numId w:val="51"/>
+        </w:numPr>
+        <w:spacing w:before="20" w:after="40"/>
+      </w:pPr>
+      <w:r>
+        <w:rPr>
+          <w:rFonts w:ascii="Calibri" w:cs="Calibri" w:eastAsia="Calibri" w:hAnsi="Calibri"/>
+        </w:rPr>
+        <w:t xml:space="preserve">⬜ SBOM (</w:t>
+      </w:r>
+      <w:r>
+        <w:rPr>
+          <w:color w:val="B0306A"/>
+          <w:sz w:val="19"/>
+          <w:szCs w:val="19"/>
+          <w:rFonts w:ascii="Consolas" w:cs="Consolas" w:eastAsia="Consolas" w:hAnsi="Consolas"/>
+          <w:shd w:fill="EEF1F5" w:color="auto" w:val="clear"/>
+        </w:rPr>
+        <w:t xml:space="preserve">trivy image --format cyclonedx</w:t>
+      </w:r>
+      <w:r>
+        <w:rPr>
+          <w:rFonts w:ascii="Calibri" w:cs="Calibri" w:eastAsia="Calibri" w:hAnsi="Calibri"/>
+        </w:rPr>
+        <w:t xml:space="preserve">), SonarQube</w:t>
+      </w:r>
+    </w:p>
+    <w:p>
+      <w:pPr>
+        <w:pBdr>
+          <w:bottom w:val="single" w:color="BFC8D2" w:sz="6" w:space="1"/>
+        </w:pBdr>
+        <w:spacing w:before="120" w:after="200"/>
+      </w:pPr>
+    </w:p>
+    <w:p>
+      <w:pPr>
+        <w:pStyle w:val="Heading2"/>
+        <w:keepNext/>
+      </w:pPr>
+      <w:r>
+        <w:rPr>
+          <w:rFonts w:ascii="Calibri" w:cs="Calibri" w:eastAsia="Calibri" w:hAnsi="Calibri"/>
+        </w:rPr>
+        <w:t xml:space="preserve">I. Infra changes promote karna</w:t>
+      </w:r>
+    </w:p>
+    <w:p>
+      <w:pPr>
+        <w:spacing w:after="120"/>
+      </w:pPr>
+      <w:r>
+        <w:rPr>
+          <w:rFonts w:ascii="Calibri" w:cs="Calibri" w:eastAsia="Calibri" w:hAnsi="Calibri"/>
+        </w:rPr>
+        <w:t xml:space="preserve">Do tarah ka "infra" hai, aur dono dev → staging → prod jaate hain:</w:t>
       </w:r>
     </w:p>
     <w:p>
@@ -44586,13 +45317,13 @@
           <w:bCs/>
           <w:rFonts w:ascii="Calibri" w:cs="Calibri" w:eastAsia="Calibri" w:hAnsi="Calibri"/>
         </w:rPr>
-        <w:t xml:space="preserve">2. Cluster add-ons (Argo CD):</w:t>
-      </w:r>
-      <w:r>
-        <w:rPr>
-          <w:rFonts w:ascii="Calibri" w:cs="Calibri" w:eastAsia="Calibri" w:hAnsi="Calibri"/>
-        </w:rPr>
-        <w:t xml:space="preserve"> e.g. Kyverno chart upgrade:</w:t>
+        <w:t xml:space="preserve">1. AWS infra (Terraform):</w:t>
+      </w:r>
+      <w:r>
+        <w:rPr>
+          <w:rFonts w:ascii="Calibri" w:cs="Calibri" w:eastAsia="Calibri" w:hAnsi="Calibri"/>
+        </w:rPr>
+        <w:t xml:space="preserve"> e.g. prod workers 3 se 4 karne hain:</w:t>
       </w:r>
     </w:p>
     <w:p>
@@ -44612,7 +45343,7 @@
           <w:rFonts w:ascii="Consolas" w:cs="Consolas" w:eastAsia="Consolas" w:hAnsi="Consolas"/>
           <w:shd w:fill="EEF1F5" w:color="auto" w:val="clear"/>
         </w:rPr>
-        <w:t xml:space="preserve">gitops/clusters/dev/addons.yaml</w:t>
+        <w:t xml:space="preserve">terraform/stacks/cluster/envs/prod.tfvars</w:t>
       </w:r>
       <w:r>
         <w:rPr>
@@ -44628,13 +45359,29 @@
           <w:rFonts w:ascii="Consolas" w:cs="Consolas" w:eastAsia="Consolas" w:hAnsi="Consolas"/>
           <w:shd w:fill="EEF1F5" w:color="auto" w:val="clear"/>
         </w:rPr>
-        <w:t xml:space="preserve">targetRevision</w:t>
-      </w:r>
-      <w:r>
-        <w:rPr>
-          <w:rFonts w:ascii="Calibri" w:cs="Calibri" w:eastAsia="Calibri" w:hAnsi="Calibri"/>
-        </w:rPr>
-        <w:t xml:space="preserve"> bump → push → Argo CD dev mein upgrade.</w:t>
+        <w:t xml:space="preserve">worker_count = 4</w:t>
+      </w:r>
+      <w:r>
+        <w:rPr>
+          <w:rFonts w:ascii="Calibri" w:cs="Calibri" w:eastAsia="Calibri" w:hAnsi="Calibri"/>
+        </w:rPr>
+        <w:t xml:space="preserve"> → commit → </w:t>
+      </w:r>
+      <w:r>
+        <w:rPr>
+          <w:color w:val="B0306A"/>
+          <w:sz w:val="19"/>
+          <w:szCs w:val="19"/>
+          <w:rFonts w:ascii="Consolas" w:cs="Consolas" w:eastAsia="Consolas" w:hAnsi="Consolas"/>
+          <w:shd w:fill="EEF1F5" w:color="auto" w:val="clear"/>
+        </w:rPr>
+        <w:t xml:space="preserve">order-platform-infra</w:t>
+      </w:r>
+      <w:r>
+        <w:rPr>
+          <w:rFonts w:ascii="Calibri" w:cs="Calibri" w:eastAsia="Calibri" w:hAnsi="Calibri"/>
+        </w:rPr>
+        <w:t xml:space="preserve"> job chala.</w:t>
       </w:r>
     </w:p>
     <w:p>
@@ -44650,8 +45397,37 @@
         <w:rPr>
           <w:rFonts w:ascii="Calibri" w:cs="Calibri" w:eastAsia="Calibri" w:hAnsi="Calibri"/>
         </w:rPr>
-        <w:t xml:space="preserve">1–2 din dev mein chala, sab theek → same change </w:t>
-      </w:r>
+        <w:t xml:space="preserve">Module code change (sab envs ko affect karta hai)? Pipeline pehle dev apply karegi, phir staging plan + approval, phir prod plan + approval.</w:t>
+      </w:r>
+    </w:p>
+    <w:p>
+      <w:pPr>
+        <w:spacing w:after="120"/>
+      </w:pPr>
+      <w:r>
+        <w:rPr>
+          <w:b/>
+          <w:bCs/>
+          <w:rFonts w:ascii="Calibri" w:cs="Calibri" w:eastAsia="Calibri" w:hAnsi="Calibri"/>
+        </w:rPr>
+        <w:t xml:space="preserve">2. Cluster add-ons (Argo CD):</w:t>
+      </w:r>
+      <w:r>
+        <w:rPr>
+          <w:rFonts w:ascii="Calibri" w:cs="Calibri" w:eastAsia="Calibri" w:hAnsi="Calibri"/>
+        </w:rPr>
+        <w:t xml:space="preserve"> e.g. Kyverno chart upgrade:</w:t>
+      </w:r>
+    </w:p>
+    <w:p>
+      <w:pPr>
+        <w:pStyle w:val="ListParagraph"/>
+        <w:numPr>
+          <w:ilvl w:val="0"/>
+          <w:numId w:val="53"/>
+        </w:numPr>
+        <w:spacing w:before="20" w:after="40"/>
+      </w:pPr>
       <w:r>
         <w:rPr>
           <w:color w:val="B0306A"/>
@@ -44660,13 +45436,13 @@
           <w:rFonts w:ascii="Consolas" w:cs="Consolas" w:eastAsia="Consolas" w:hAnsi="Consolas"/>
           <w:shd w:fill="EEF1F5" w:color="auto" w:val="clear"/>
         </w:rPr>
-        <w:t xml:space="preserve">clusters/staging/addons.yaml</w:t>
-      </w:r>
-      <w:r>
-        <w:rPr>
-          <w:rFonts w:ascii="Calibri" w:cs="Calibri" w:eastAsia="Calibri" w:hAnsi="Calibri"/>
-        </w:rPr>
-        <w:t xml:space="preserve"> → phir </w:t>
+        <w:t xml:space="preserve">gitops/clusters/dev/addons.yaml</w:t>
+      </w:r>
+      <w:r>
+        <w:rPr>
+          <w:rFonts w:ascii="Calibri" w:cs="Calibri" w:eastAsia="Calibri" w:hAnsi="Calibri"/>
+        </w:rPr>
+        <w:t xml:space="preserve"> mein </w:t>
       </w:r>
       <w:r>
         <w:rPr>
@@ -44676,13 +45452,13 @@
           <w:rFonts w:ascii="Consolas" w:cs="Consolas" w:eastAsia="Consolas" w:hAnsi="Consolas"/>
           <w:shd w:fill="EEF1F5" w:color="auto" w:val="clear"/>
         </w:rPr>
-        <w:t xml:space="preserve">clusters/prod/addons.yaml</w:t>
-      </w:r>
-      <w:r>
-        <w:rPr>
-          <w:rFonts w:ascii="Calibri" w:cs="Calibri" w:eastAsia="Calibri" w:hAnsi="Calibri"/>
-        </w:rPr>
-        <w:t xml:space="preserve">.</w:t>
+        <w:t xml:space="preserve">targetRevision</w:t>
+      </w:r>
+      <w:r>
+        <w:rPr>
+          <w:rFonts w:ascii="Calibri" w:cs="Calibri" w:eastAsia="Calibri" w:hAnsi="Calibri"/>
+        </w:rPr>
+        <w:t xml:space="preserve"> bump → push → Argo CD dev mein upgrade.</w:t>
       </w:r>
     </w:p>
     <w:p>
@@ -44690,7 +45466,55 @@
         <w:pStyle w:val="ListParagraph"/>
         <w:numPr>
           <w:ilvl w:val="0"/>
-          <w:numId w:val="52"/>
+          <w:numId w:val="53"/>
+        </w:numPr>
+        <w:spacing w:before="20" w:after="40"/>
+      </w:pPr>
+      <w:r>
+        <w:rPr>
+          <w:rFonts w:ascii="Calibri" w:cs="Calibri" w:eastAsia="Calibri" w:hAnsi="Calibri"/>
+        </w:rPr>
+        <w:t xml:space="preserve">1–2 din dev mein chala, sab theek → same change </w:t>
+      </w:r>
+      <w:r>
+        <w:rPr>
+          <w:color w:val="B0306A"/>
+          <w:sz w:val="19"/>
+          <w:szCs w:val="19"/>
+          <w:rFonts w:ascii="Consolas" w:cs="Consolas" w:eastAsia="Consolas" w:hAnsi="Consolas"/>
+          <w:shd w:fill="EEF1F5" w:color="auto" w:val="clear"/>
+        </w:rPr>
+        <w:t xml:space="preserve">clusters/staging/addons.yaml</w:t>
+      </w:r>
+      <w:r>
+        <w:rPr>
+          <w:rFonts w:ascii="Calibri" w:cs="Calibri" w:eastAsia="Calibri" w:hAnsi="Calibri"/>
+        </w:rPr>
+        <w:t xml:space="preserve"> → phir </w:t>
+      </w:r>
+      <w:r>
+        <w:rPr>
+          <w:color w:val="B0306A"/>
+          <w:sz w:val="19"/>
+          <w:szCs w:val="19"/>
+          <w:rFonts w:ascii="Consolas" w:cs="Consolas" w:eastAsia="Consolas" w:hAnsi="Consolas"/>
+          <w:shd w:fill="EEF1F5" w:color="auto" w:val="clear"/>
+        </w:rPr>
+        <w:t xml:space="preserve">clusters/prod/addons.yaml</w:t>
+      </w:r>
+      <w:r>
+        <w:rPr>
+          <w:rFonts w:ascii="Calibri" w:cs="Calibri" w:eastAsia="Calibri" w:hAnsi="Calibri"/>
+        </w:rPr>
+        <w:t xml:space="preserve">.</w:t>
+      </w:r>
+    </w:p>
+    <w:p>
+      <w:pPr>
+        <w:pStyle w:val="ListParagraph"/>
+        <w:numPr>
+          <w:ilvl w:val="0"/>
+          <w:numId w:val="53"/>
         </w:numPr>
         <w:spacing w:before="20" w:after="40"/>
       </w:pPr>
@@ -45612,7 +46436,7 @@
               </w:rPr>
               <w:t xml:space="preserve">; </w:t>
             </w:r>
-            <w:hyperlink w:history="1" r:id="rIdeadenna1372cuzkzf-puo">
+            <w:hyperlink w:history="1" r:id="rIduu-h5ywzgjpknxxfj8mpl">
               <w:r>
                 <w:rPr>
                   <w:u w:val="single"/>
@@ -52148,6 +52972,504 @@
           </w:p>
         </w:tc>
       </w:tr>
+      <w:tr>
+        <w:trPr>
+          <w:cantSplit/>
+        </w:trPr>
+        <w:tc>
+          <w:tcPr>
+            <w:tcW w:type="dxa" w:w="3212"/>
+            <w:tcBorders>
+              <w:top w:val="single" w:color="BFC8D2" w:sz="4"/>
+              <w:left w:val="single" w:color="BFC8D2" w:sz="4"/>
+              <w:bottom w:val="single" w:color="BFC8D2" w:sz="4"/>
+              <w:right w:val="single" w:color="BFC8D2" w:sz="4"/>
+            </w:tcBorders>
+            <w:tcMar>
+              <w:top w:type="dxa" w:w="50"/>
+              <w:left w:type="dxa" w:w="90"/>
+              <w:bottom w:type="dxa" w:w="50"/>
+              <w:right w:type="dxa" w:w="90"/>
+            </w:tcMar>
+          </w:tcPr>
+          <w:p>
+            <w:pPr>
+              <w:spacing w:before="0" w:after="0"/>
+            </w:pPr>
+            <w:r>
+              <w:rPr>
+                <w:sz w:val="18"/>
+                <w:szCs w:val="18"/>
+                <w:rFonts w:ascii="Calibri" w:cs="Calibri" w:eastAsia="Calibri" w:hAnsi="Calibri"/>
+              </w:rPr>
+              <w:t xml:space="preserve">Grafana Availability / Error budget </w:t>
+            </w:r>
+            <w:r>
+              <w:rPr>
+                <w:b/>
+                <w:bCs/>
+                <w:sz w:val="18"/>
+                <w:szCs w:val="18"/>
+                <w:rFonts w:ascii="Calibri" w:cs="Calibri" w:eastAsia="Calibri" w:hAnsi="Calibri"/>
+              </w:rPr>
+              <w:t xml:space="preserve">"No data"</w:t>
+            </w:r>
+            <w:r>
+              <w:rPr>
+                <w:sz w:val="18"/>
+                <w:szCs w:val="18"/>
+                <w:rFonts w:ascii="Calibri" w:cs="Calibri" w:eastAsia="Calibri" w:hAnsi="Calibri"/>
+              </w:rPr>
+              <w:t xml:space="preserve">, baaki panels theek</w:t>
+            </w:r>
+          </w:p>
+        </w:tc>
+        <w:tc>
+          <w:tcPr>
+            <w:tcW w:type="dxa" w:w="3212"/>
+            <w:tcBorders>
+              <w:top w:val="single" w:color="BFC8D2" w:sz="4"/>
+              <w:left w:val="single" w:color="BFC8D2" w:sz="4"/>
+              <w:bottom w:val="single" w:color="BFC8D2" w:sz="4"/>
+              <w:right w:val="single" w:color="BFC8D2" w:sz="4"/>
+            </w:tcBorders>
+            <w:tcMar>
+              <w:top w:type="dxa" w:w="50"/>
+              <w:left w:type="dxa" w:w="90"/>
+              <w:bottom w:type="dxa" w:w="50"/>
+              <w:right w:type="dxa" w:w="90"/>
+            </w:tcMar>
+          </w:tcPr>
+          <w:p>
+            <w:pPr>
+              <w:spacing w:before="0" w:after="0"/>
+            </w:pPr>
+            <w:r>
+              <w:rPr>
+                <w:sz w:val="18"/>
+                <w:szCs w:val="18"/>
+                <w:rFonts w:ascii="Calibri" w:cs="Calibri" w:eastAsia="Calibri" w:hAnsi="Calibri"/>
+              </w:rPr>
+              <w:t xml:space="preserve">5xx series exist hi nahi (koi error nahi aaya); PromQL mein </w:t>
+            </w:r>
+            <w:r>
+              <w:rPr>
+                <w:color w:val="B0306A"/>
+                <w:sz w:val="16"/>
+                <w:szCs w:val="16"/>
+                <w:rFonts w:ascii="Consolas" w:cs="Consolas" w:eastAsia="Consolas" w:hAnsi="Consolas"/>
+                <w:shd w:fill="EEF1F5" w:color="auto" w:val="clear"/>
+              </w:rPr>
+              <w:t xml:space="preserve">sum(khaali)</w:t>
+            </w:r>
+            <w:r>
+              <w:rPr>
+                <w:sz w:val="18"/>
+                <w:szCs w:val="18"/>
+                <w:rFonts w:ascii="Calibri" w:cs="Calibri" w:eastAsia="Calibri" w:hAnsi="Calibri"/>
+              </w:rPr>
+              <w:t xml:space="preserve"> = khaali, 0 nahi</w:t>
+            </w:r>
+          </w:p>
+        </w:tc>
+        <w:tc>
+          <w:tcPr>
+            <w:tcW w:type="dxa" w:w="3214"/>
+            <w:tcBorders>
+              <w:top w:val="single" w:color="BFC8D2" w:sz="4"/>
+              <w:left w:val="single" w:color="BFC8D2" w:sz="4"/>
+              <w:bottom w:val="single" w:color="BFC8D2" w:sz="4"/>
+              <w:right w:val="single" w:color="BFC8D2" w:sz="4"/>
+            </w:tcBorders>
+            <w:tcMar>
+              <w:top w:type="dxa" w:w="50"/>
+              <w:left w:type="dxa" w:w="90"/>
+              <w:bottom w:type="dxa" w:w="50"/>
+              <w:right w:type="dxa" w:w="90"/>
+            </w:tcMar>
+          </w:tcPr>
+          <w:p>
+            <w:pPr>
+              <w:spacing w:before="0" w:after="0"/>
+            </w:pPr>
+            <w:r>
+              <w:rPr>
+                <w:sz w:val="18"/>
+                <w:szCs w:val="18"/>
+                <w:rFonts w:ascii="Calibri" w:cs="Calibri" w:eastAsia="Calibri" w:hAnsi="Calibri"/>
+              </w:rPr>
+              <w:t xml:space="preserve">Prometheus API pe rule query: </w:t>
+            </w:r>
+            <w:r>
+              <w:rPr>
+                <w:color w:val="B0306A"/>
+                <w:sz w:val="16"/>
+                <w:szCs w:val="16"/>
+                <w:rFonts w:ascii="Consolas" w:cs="Consolas" w:eastAsia="Consolas" w:hAnsi="Consolas"/>
+                <w:shd w:fill="EEF1F5" w:color="auto" w:val="clear"/>
+              </w:rPr>
+              <w:t xml:space="preserve">slo:sli_error:ratio_rate1h</w:t>
+            </w:r>
+            <w:r>
+              <w:rPr>
+                <w:sz w:val="18"/>
+                <w:szCs w:val="18"/>
+                <w:rFonts w:ascii="Calibri" w:cs="Calibri" w:eastAsia="Calibri" w:hAnsi="Calibri"/>
+              </w:rPr>
+              <w:t xml:space="preserve"> → </w:t>
+            </w:r>
+            <w:r>
+              <w:rPr>
+                <w:color w:val="B0306A"/>
+                <w:sz w:val="16"/>
+                <w:szCs w:val="16"/>
+                <w:rFonts w:ascii="Consolas" w:cs="Consolas" w:eastAsia="Consolas" w:hAnsi="Consolas"/>
+                <w:shd w:fill="EEF1F5" w:color="auto" w:val="clear"/>
+              </w:rPr>
+              <w:t xml:space="preserve">[]</w:t>
+            </w:r>
+            <w:r>
+              <w:rPr>
+                <w:sz w:val="18"/>
+                <w:szCs w:val="18"/>
+                <w:rFonts w:ascii="Calibri" w:cs="Calibri" w:eastAsia="Calibri" w:hAnsi="Calibri"/>
+              </w:rPr>
+              <w:t xml:space="preserve">. Fix: SLI rules mein </w:t>
+            </w:r>
+            <w:r>
+              <w:rPr>
+                <w:color w:val="B0306A"/>
+                <w:sz w:val="16"/>
+                <w:szCs w:val="16"/>
+                <w:rFonts w:ascii="Consolas" w:cs="Consolas" w:eastAsia="Consolas" w:hAnsi="Consolas"/>
+                <w:shd w:fill="EEF1F5" w:color="auto" w:val="clear"/>
+              </w:rPr>
+              <w:t xml:space="preserve">(sum(rate(...5xx...)) or vector(0)) / sum(rate(...))</w:t>
+            </w:r>
+          </w:p>
+        </w:tc>
+      </w:tr>
+      <w:tr>
+        <w:trPr>
+          <w:cantSplit/>
+        </w:trPr>
+        <w:tc>
+          <w:tcPr>
+            <w:tcW w:type="dxa" w:w="3212"/>
+            <w:tcBorders>
+              <w:top w:val="single" w:color="BFC8D2" w:sz="4"/>
+              <w:left w:val="single" w:color="BFC8D2" w:sz="4"/>
+              <w:bottom w:val="single" w:color="BFC8D2" w:sz="4"/>
+              <w:right w:val="single" w:color="BFC8D2" w:sz="4"/>
+            </w:tcBorders>
+            <w:shd w:fill="F3F6FA" w:color="auto" w:val="clear"/>
+            <w:tcMar>
+              <w:top w:type="dxa" w:w="50"/>
+              <w:left w:type="dxa" w:w="90"/>
+              <w:bottom w:type="dxa" w:w="50"/>
+              <w:right w:type="dxa" w:w="90"/>
+            </w:tcMar>
+          </w:tcPr>
+          <w:p>
+            <w:pPr>
+              <w:spacing w:before="0" w:after="0"/>
+            </w:pPr>
+            <w:r>
+              <w:rPr>
+                <w:sz w:val="18"/>
+                <w:szCs w:val="18"/>
+                <w:rFonts w:ascii="Calibri" w:cs="Calibri" w:eastAsia="Calibri" w:hAnsi="Calibri"/>
+              </w:rPr>
+              <w:t xml:space="preserve">Abort dabaya, phir Slack: "failed post-deploy verification" + GitOps revert</w:t>
+            </w:r>
+          </w:p>
+        </w:tc>
+        <w:tc>
+          <w:tcPr>
+            <w:tcW w:type="dxa" w:w="3212"/>
+            <w:tcBorders>
+              <w:top w:val="single" w:color="BFC8D2" w:sz="4"/>
+              <w:left w:val="single" w:color="BFC8D2" w:sz="4"/>
+              <w:bottom w:val="single" w:color="BFC8D2" w:sz="4"/>
+              <w:right w:val="single" w:color="BFC8D2" w:sz="4"/>
+            </w:tcBorders>
+            <w:shd w:fill="F3F6FA" w:color="auto" w:val="clear"/>
+            <w:tcMar>
+              <w:top w:type="dxa" w:w="50"/>
+              <w:left w:type="dxa" w:w="90"/>
+              <w:bottom w:type="dxa" w:w="50"/>
+              <w:right w:type="dxa" w:w="90"/>
+            </w:tcMar>
+          </w:tcPr>
+          <w:p>
+            <w:pPr>
+              <w:spacing w:before="0" w:after="0"/>
+            </w:pPr>
+            <w:r>
+              <w:rPr>
+                <w:sz w:val="18"/>
+                <w:szCs w:val="18"/>
+                <w:rFonts w:ascii="Calibri" w:cs="Calibri" w:eastAsia="Calibri" w:hAnsi="Calibri"/>
+              </w:rPr>
+              <w:t xml:space="preserve">Jenkinsfile </w:t>
+            </w:r>
+            <w:r>
+              <w:rPr>
+                <w:color w:val="B0306A"/>
+                <w:sz w:val="16"/>
+                <w:szCs w:val="16"/>
+                <w:rFonts w:ascii="Consolas" w:cs="Consolas" w:eastAsia="Consolas" w:hAnsi="Consolas"/>
+                <w:shd w:fill="EEF1F5" w:color="auto" w:val="clear"/>
+              </w:rPr>
+              <w:t xml:space="preserve">catch (err)</w:t>
+            </w:r>
+            <w:r>
+              <w:rPr>
+                <w:sz w:val="18"/>
+                <w:szCs w:val="18"/>
+                <w:rFonts w:ascii="Calibri" w:cs="Calibri" w:eastAsia="Calibri" w:hAnsi="Calibri"/>
+              </w:rPr>
+              <w:t xml:space="preserve"> ne abort (</w:t>
+            </w:r>
+            <w:r>
+              <w:rPr>
+                <w:color w:val="B0306A"/>
+                <w:sz w:val="16"/>
+                <w:szCs w:val="16"/>
+                <w:rFonts w:ascii="Consolas" w:cs="Consolas" w:eastAsia="Consolas" w:hAnsi="Consolas"/>
+                <w:shd w:fill="EEF1F5" w:color="auto" w:val="clear"/>
+              </w:rPr>
+              <w:t xml:space="preserve">FlowInterruptedException</w:t>
+            </w:r>
+            <w:r>
+              <w:rPr>
+                <w:sz w:val="18"/>
+                <w:szCs w:val="18"/>
+                <w:rFonts w:ascii="Calibri" w:cs="Calibri" w:eastAsia="Calibri" w:hAnsi="Calibri"/>
+              </w:rPr>
+              <w:t xml:space="preserve">) bhi pakad liya</w:t>
+            </w:r>
+          </w:p>
+        </w:tc>
+        <w:tc>
+          <w:tcPr>
+            <w:tcW w:type="dxa" w:w="3214"/>
+            <w:tcBorders>
+              <w:top w:val="single" w:color="BFC8D2" w:sz="4"/>
+              <w:left w:val="single" w:color="BFC8D2" w:sz="4"/>
+              <w:bottom w:val="single" w:color="BFC8D2" w:sz="4"/>
+              <w:right w:val="single" w:color="BFC8D2" w:sz="4"/>
+            </w:tcBorders>
+            <w:shd w:fill="F3F6FA" w:color="auto" w:val="clear"/>
+            <w:tcMar>
+              <w:top w:type="dxa" w:w="50"/>
+              <w:left w:type="dxa" w:w="90"/>
+              <w:bottom w:type="dxa" w:w="50"/>
+              <w:right w:type="dxa" w:w="90"/>
+            </w:tcMar>
+          </w:tcPr>
+          <w:p>
+            <w:pPr>
+              <w:spacing w:before="0" w:after="0"/>
+            </w:pPr>
+            <w:r>
+              <w:rPr>
+                <w:sz w:val="18"/>
+                <w:szCs w:val="18"/>
+                <w:rFonts w:ascii="Calibri" w:cs="Calibri" w:eastAsia="Calibri" w:hAnsi="Calibri"/>
+              </w:rPr>
+              <w:t xml:space="preserve">Console: </w:t>
+            </w:r>
+            <w:r>
+              <w:rPr>
+                <w:color w:val="B0306A"/>
+                <w:sz w:val="16"/>
+                <w:szCs w:val="16"/>
+                <w:rFonts w:ascii="Consolas" w:cs="Consolas" w:eastAsia="Consolas" w:hAnsi="Consolas"/>
+                <w:shd w:fill="EEF1F5" w:color="auto" w:val="clear"/>
+              </w:rPr>
+              <w:t xml:space="preserve">Sending interrupt signal to process</w:t>
+            </w:r>
+            <w:r>
+              <w:rPr>
+                <w:sz w:val="18"/>
+                <w:szCs w:val="18"/>
+                <w:rFonts w:ascii="Calibri" w:cs="Calibri" w:eastAsia="Calibri" w:hAnsi="Calibri"/>
+              </w:rPr>
+              <w:t xml:space="preserve"> = abort. Fix: </w:t>
+            </w:r>
+            <w:r>
+              <w:rPr>
+                <w:color w:val="B0306A"/>
+                <w:sz w:val="16"/>
+                <w:szCs w:val="16"/>
+                <w:rFonts w:ascii="Consolas" w:cs="Consolas" w:eastAsia="Consolas" w:hAnsi="Consolas"/>
+                <w:shd w:fill="EEF1F5" w:color="auto" w:val="clear"/>
+              </w:rPr>
+              <w:t xml:space="preserve">catch (org.jenkinsci.plugins.workflow.steps.FlowInterruptedException e) { throw e }</w:t>
+            </w:r>
+            <w:r>
+              <w:rPr>
+                <w:sz w:val="18"/>
+                <w:szCs w:val="18"/>
+                <w:rFonts w:ascii="Calibri" w:cs="Calibri" w:eastAsia="Calibri" w:hAnsi="Calibri"/>
+              </w:rPr>
+              <w:t xml:space="preserve"> generic catch se pehle. Canary (~8–9 min) ke beech abort mat daba</w:t>
+            </w:r>
+          </w:p>
+        </w:tc>
+      </w:tr>
+      <w:tr>
+        <w:trPr>
+          <w:cantSplit/>
+        </w:trPr>
+        <w:tc>
+          <w:tcPr>
+            <w:tcW w:type="dxa" w:w="3212"/>
+            <w:tcBorders>
+              <w:top w:val="single" w:color="BFC8D2" w:sz="4"/>
+              <w:left w:val="single" w:color="BFC8D2" w:sz="4"/>
+              <w:bottom w:val="single" w:color="BFC8D2" w:sz="4"/>
+              <w:right w:val="single" w:color="BFC8D2" w:sz="4"/>
+            </w:tcBorders>
+            <w:tcMar>
+              <w:top w:type="dxa" w:w="50"/>
+              <w:left w:type="dxa" w:w="90"/>
+              <w:bottom w:type="dxa" w:w="50"/>
+              <w:right w:type="dxa" w:w="90"/>
+            </w:tcMar>
+          </w:tcPr>
+          <w:p>
+            <w:pPr>
+              <w:spacing w:before="0" w:after="0"/>
+            </w:pPr>
+            <w:r>
+              <w:rPr>
+                <w:sz w:val="18"/>
+                <w:szCs w:val="18"/>
+                <w:rFonts w:ascii="Calibri" w:cs="Calibri" w:eastAsia="Calibri" w:hAnsi="Calibri"/>
+              </w:rPr>
+              <w:t xml:space="preserve">Gitops </w:t>
+            </w:r>
+            <w:r>
+              <w:rPr>
+                <w:color w:val="B0306A"/>
+                <w:sz w:val="16"/>
+                <w:szCs w:val="16"/>
+                <w:rFonts w:ascii="Consolas" w:cs="Consolas" w:eastAsia="Consolas" w:hAnsi="Consolas"/>
+                <w:shd w:fill="EEF1F5" w:color="auto" w:val="clear"/>
+              </w:rPr>
+              <w:t xml:space="preserve">git push</w:t>
+            </w:r>
+            <w:r>
+              <w:rPr>
+                <w:sz w:val="18"/>
+                <w:szCs w:val="18"/>
+                <w:rFonts w:ascii="Calibri" w:cs="Calibri" w:eastAsia="Calibri" w:hAnsi="Calibri"/>
+              </w:rPr>
+              <w:t xml:space="preserve"> → </w:t>
+            </w:r>
+            <w:r>
+              <w:rPr>
+                <w:color w:val="B0306A"/>
+                <w:sz w:val="16"/>
+                <w:szCs w:val="16"/>
+                <w:rFonts w:ascii="Consolas" w:cs="Consolas" w:eastAsia="Consolas" w:hAnsi="Consolas"/>
+                <w:shd w:fill="EEF1F5" w:color="auto" w:val="clear"/>
+              </w:rPr>
+              <w:t xml:space="preserve">rejected (non-fast-forward)</w:t>
+            </w:r>
+          </w:p>
+        </w:tc>
+        <w:tc>
+          <w:tcPr>
+            <w:tcW w:type="dxa" w:w="3212"/>
+            <w:tcBorders>
+              <w:top w:val="single" w:color="BFC8D2" w:sz="4"/>
+              <w:left w:val="single" w:color="BFC8D2" w:sz="4"/>
+              <w:bottom w:val="single" w:color="BFC8D2" w:sz="4"/>
+              <w:right w:val="single" w:color="BFC8D2" w:sz="4"/>
+            </w:tcBorders>
+            <w:tcMar>
+              <w:top w:type="dxa" w:w="50"/>
+              <w:left w:type="dxa" w:w="90"/>
+              <w:bottom w:type="dxa" w:w="50"/>
+              <w:right w:type="dxa" w:w="90"/>
+            </w:tcMar>
+          </w:tcPr>
+          <w:p>
+            <w:pPr>
+              <w:spacing w:before="0" w:after="0"/>
+            </w:pPr>
+            <w:r>
+              <w:rPr>
+                <w:sz w:val="18"/>
+                <w:szCs w:val="18"/>
+                <w:rFonts w:ascii="Calibri" w:cs="Calibri" w:eastAsia="Calibri" w:hAnsi="Calibri"/>
+              </w:rPr>
+              <w:t xml:space="preserve">Jenkins ne beech mein </w:t>
+            </w:r>
+            <w:r>
+              <w:rPr>
+                <w:color w:val="B0306A"/>
+                <w:sz w:val="16"/>
+                <w:szCs w:val="16"/>
+                <w:rFonts w:ascii="Consolas" w:cs="Consolas" w:eastAsia="Consolas" w:hAnsi="Consolas"/>
+                <w:shd w:fill="EEF1F5" w:color="auto" w:val="clear"/>
+              </w:rPr>
+              <w:t xml:space="preserve">promote(dev)</w:t>
+            </w:r>
+            <w:r>
+              <w:rPr>
+                <w:sz w:val="18"/>
+                <w:szCs w:val="18"/>
+                <w:rFonts w:ascii="Calibri" w:cs="Calibri" w:eastAsia="Calibri" w:hAnsi="Calibri"/>
+              </w:rPr>
+              <w:t xml:space="preserve"> commit kiya</w:t>
+            </w:r>
+          </w:p>
+        </w:tc>
+        <w:tc>
+          <w:tcPr>
+            <w:tcW w:type="dxa" w:w="3214"/>
+            <w:tcBorders>
+              <w:top w:val="single" w:color="BFC8D2" w:sz="4"/>
+              <w:left w:val="single" w:color="BFC8D2" w:sz="4"/>
+              <w:bottom w:val="single" w:color="BFC8D2" w:sz="4"/>
+              <w:right w:val="single" w:color="BFC8D2" w:sz="4"/>
+            </w:tcBorders>
+            <w:tcMar>
+              <w:top w:type="dxa" w:w="50"/>
+              <w:left w:type="dxa" w:w="90"/>
+              <w:bottom w:type="dxa" w:w="50"/>
+              <w:right w:type="dxa" w:w="90"/>
+            </w:tcMar>
+          </w:tcPr>
+          <w:p>
+            <w:pPr>
+              <w:spacing w:before="0" w:after="0"/>
+            </w:pPr>
+            <w:r>
+              <w:rPr>
+                <w:color w:val="B0306A"/>
+                <w:sz w:val="16"/>
+                <w:szCs w:val="16"/>
+                <w:rFonts w:ascii="Consolas" w:cs="Consolas" w:eastAsia="Consolas" w:hAnsi="Consolas"/>
+                <w:shd w:fill="EEF1F5" w:color="auto" w:val="clear"/>
+              </w:rPr>
+              <w:t xml:space="preserve">git pull --rebase &amp;&amp; git push</w:t>
+            </w:r>
+            <w:r>
+              <w:rPr>
+                <w:sz w:val="18"/>
+                <w:szCs w:val="18"/>
+                <w:rFonts w:ascii="Calibri" w:cs="Calibri" w:eastAsia="Calibri" w:hAnsi="Calibri"/>
+              </w:rPr>
+              <w:t xml:space="preserve"> (gitops repo mein do likhne wale: tu + Jenkins)</w:t>
+            </w:r>
+          </w:p>
+        </w:tc>
+      </w:tr>
     </w:tbl>
     <w:p>
       <w:pPr>
@@ -52590,7 +53912,7 @@
         <w:pStyle w:val="ListParagraph"/>
         <w:numPr>
           <w:ilvl w:val="0"/>
-          <w:numId w:val="53"/>
+          <w:numId w:val="54"/>
         </w:numPr>
         <w:spacing w:before="20" w:after="40"/>
       </w:pPr>
@@ -52636,7 +53958,7 @@
         <w:pStyle w:val="ListParagraph"/>
         <w:numPr>
           <w:ilvl w:val="0"/>
-          <w:numId w:val="53"/>
+          <w:numId w:val="54"/>
         </w:numPr>
         <w:spacing w:before="20" w:after="40"/>
       </w:pPr>
@@ -52666,7 +53988,7 @@
         <w:pStyle w:val="ListParagraph"/>
         <w:numPr>
           <w:ilvl w:val="0"/>
-          <w:numId w:val="53"/>
+          <w:numId w:val="54"/>
         </w:numPr>
         <w:spacing w:before="20" w:after="40"/>
       </w:pPr>
@@ -54107,13 +55429,13 @@
     </w:lvlOverride>
   </w:num>
   <w:num w:numId="36">
-    <w:abstractNumId w:val="3"/>
+    <w:abstractNumId w:val="2"/>
     <w:lvlOverride w:ilvl="0">
       <w:startOverride w:val="1"/>
     </w:lvlOverride>
   </w:num>
   <w:num w:numId="37">
-    <w:abstractNumId w:val="2"/>
+    <w:abstractNumId w:val="3"/>
     <w:lvlOverride w:ilvl="0">
       <w:startOverride w:val="1"/>
     </w:lvlOverride>
@@ -54167,7 +55489,7 @@
     </w:lvlOverride>
   </w:num>
   <w:num w:numId="46">
-    <w:abstractNumId w:val="3"/>
+    <w:abstractNumId w:val="2"/>
     <w:lvlOverride w:ilvl="0">
       <w:startOverride w:val="1"/>
     </w:lvlOverride>
@@ -54179,7 +55501,7 @@
     </w:lvlOverride>
   </w:num>
   <w:num w:numId="48">
-    <w:abstractNumId w:val="2"/>
+    <w:abstractNumId w:val="3"/>
     <w:lvlOverride w:ilvl="0">
       <w:startOverride w:val="1"/>
     </w:lvlOverride>
@@ -54209,6 +55531,12 @@
     </w:lvlOverride>
   </w:num>
   <w:num w:numId="53">
+    <w:abstractNumId w:val="2"/>
+    <w:lvlOverride w:ilvl="0">
+      <w:startOverride w:val="1"/>
+    </w:lvlOverride>
+  </w:num>
+  <w:num w:numId="54">
     <w:abstractNumId w:val="2"/>
     <w:lvlOverride w:ilvl="0">
       <w:startOverride w:val="1"/>

</xml_diff>